<commit_message>
small changes to progress report and proposal
</commit_message>
<xml_diff>
--- a/Documents/Progress Report Template.docx
+++ b/Documents/Progress Report Template.docx
@@ -67,7 +67,15 @@
           <w:b/>
           <w:sz w:val="24"/>
         </w:rPr>
-        <w:t xml:space="preserve"> X</w:t>
+        <w:t xml:space="preserve"> </w:t>
+      </w:r>
+      <w:r>
+        <w:rPr>
+          <w:rFonts w:ascii="Times New Roman" w:hAnsi="Times New Roman" w:cs="Times New Roman"/>
+          <w:b/>
+          <w:sz w:val="24"/>
+        </w:rPr>
+        <w:t>1</w:t>
       </w:r>
       <w:r>
         <w:rPr>
@@ -94,91 +102,15 @@
           <w:b/>
           <w:sz w:val="24"/>
         </w:rPr>
-        <w:t>Group #Y</w:t>
-      </w:r>
-    </w:p>
-    <w:p>
-      <w:pPr>
-        <w:spacing w:after="0"/>
-        <w:ind w:left="360"/>
+        <w:t>Group #</w:t>
+      </w:r>
+      <w:r>
         <w:rPr>
           <w:rFonts w:ascii="Times New Roman" w:hAnsi="Times New Roman" w:cs="Times New Roman"/>
           <w:b/>
-        </w:rPr>
-      </w:pPr>
-    </w:p>
-    <w:p>
-      <w:pPr>
-        <w:pStyle w:val="ListParagraph"/>
-        <w:spacing w:before="240" w:after="240"/>
-        <w:ind w:left="360"/>
-        <w:rPr>
-          <w:rFonts w:ascii="Times New Roman" w:hAnsi="Times New Roman" w:cs="Times New Roman"/>
-        </w:rPr>
-      </w:pPr>
-      <w:r>
-        <w:rPr>
-          <w:rFonts w:ascii="Times New Roman" w:eastAsia="Times New Roman" w:hAnsi="Times New Roman" w:cs="Times New Roman"/>
-          <w:bCs/>
-          <w:i/>
-        </w:rPr>
-        <w:t xml:space="preserve">Please use this template to </w:t>
-      </w:r>
-      <w:r>
-        <w:rPr>
-          <w:rFonts w:ascii="Times New Roman" w:eastAsia="Times New Roman" w:hAnsi="Times New Roman" w:cs="Times New Roman"/>
-          <w:bCs/>
-          <w:i/>
-        </w:rPr>
-        <w:t xml:space="preserve">describe your progress on the group project in the latest </w:t>
-      </w:r>
-      <w:r>
-        <w:rPr>
-          <w:rFonts w:ascii="Times New Roman" w:eastAsia="Times New Roman" w:hAnsi="Times New Roman" w:cs="Times New Roman"/>
-          <w:bCs/>
-          <w:i/>
-        </w:rPr>
-        <w:t>increment</w:t>
-      </w:r>
-      <w:r>
-        <w:rPr>
-          <w:rFonts w:ascii="Times New Roman" w:eastAsia="Times New Roman" w:hAnsi="Times New Roman" w:cs="Times New Roman"/>
-          <w:bCs/>
-          <w:i/>
-        </w:rPr>
-        <w:t xml:space="preserve">. </w:t>
-      </w:r>
-      <w:r>
-        <w:rPr>
-          <w:rFonts w:ascii="Times New Roman" w:eastAsia="Times New Roman" w:hAnsi="Times New Roman" w:cs="Times New Roman"/>
-          <w:bCs/>
-          <w:i/>
-        </w:rPr>
-        <w:t xml:space="preserve">Please do not change the font, font size, margins or line spacing. </w:t>
-      </w:r>
-      <w:r>
-        <w:rPr>
-          <w:rFonts w:ascii="Times New Roman" w:eastAsia="Times New Roman" w:hAnsi="Times New Roman" w:cs="Times New Roman"/>
-          <w:bCs/>
-          <w:i/>
-        </w:rPr>
-        <w:t>All the text in italic should be removed from your final submission</w:t>
-      </w:r>
-      <w:r>
-        <w:rPr>
-          <w:rFonts w:ascii="Times New Roman" w:eastAsia="Times New Roman" w:hAnsi="Times New Roman" w:cs="Times New Roman"/>
-          <w:bCs/>
-          <w:i/>
-        </w:rPr>
-        <w:t>.</w:t>
-      </w:r>
-      <w:r>
-        <w:rPr>
-          <w:rFonts w:ascii="Times New Roman" w:eastAsia="Times New Roman" w:hAnsi="Times New Roman" w:cs="Times New Roman"/>
-          <w:bCs/>
-          <w:i/>
-        </w:rPr>
-        <w:t xml:space="preserve"> </w:t>
+          <w:sz w:val="24"/>
+        </w:rPr>
+        <w:t>22</w:t>
       </w:r>
     </w:p>
     <w:p>
@@ -218,8 +150,15 @@
           <w:sz w:val="22"/>
           <w:szCs w:val="22"/>
         </w:rPr>
-        <w:t xml:space="preserve">Chris Ferrer: </w:t>
-      </w:r>
+        <w:t>Chris Ferrer: CardsChris89 – caf22i</w:t>
+      </w:r>
+    </w:p>
+    <w:p>
+      <w:pPr>
+        <w:pStyle w:val="NormalWeb"/>
+        <w:spacing w:before="0" w:beforeAutospacing="0" w:after="0" w:afterAutospacing="0"/>
+        <w:ind w:left="360"/>
+      </w:pPr>
       <w:r>
         <w:rPr>
           <w:rFonts w:ascii="Arial" w:hAnsi="Arial" w:cs="Arial"/>
@@ -229,58 +168,7 @@
           <w:sz w:val="22"/>
           <w:szCs w:val="22"/>
         </w:rPr>
-        <w:t>CardsChris89</w:t>
-      </w:r>
-      <w:r>
-        <w:rPr>
-          <w:rFonts w:ascii="Arial" w:hAnsi="Arial" w:cs="Arial"/>
-          <w:b/>
-          <w:bCs/>
-          <w:color w:val="000000"/>
-          <w:sz w:val="22"/>
-          <w:szCs w:val="22"/>
-        </w:rPr>
-        <w:t xml:space="preserve"> – caf22i</w:t>
-      </w:r>
-    </w:p>
-    <w:p>
-      <w:pPr>
-        <w:pStyle w:val="NormalWeb"/>
-        <w:spacing w:before="0" w:beforeAutospacing="0" w:after="0" w:afterAutospacing="0"/>
-        <w:ind w:left="360"/>
-      </w:pPr>
-      <w:r>
-        <w:rPr>
-          <w:rFonts w:ascii="Arial" w:hAnsi="Arial" w:cs="Arial"/>
-          <w:b/>
-          <w:bCs/>
-          <w:color w:val="000000"/>
-          <w:sz w:val="22"/>
-          <w:szCs w:val="22"/>
-        </w:rPr>
-        <w:t xml:space="preserve">William Merrix: </w:t>
-      </w:r>
-      <w:r>
-        <w:rPr>
-          <w:rFonts w:ascii="Arial" w:hAnsi="Arial" w:cs="Arial"/>
-          <w:b/>
-          <w:bCs/>
-          <w:color w:val="000000"/>
-          <w:sz w:val="22"/>
-          <w:szCs w:val="22"/>
-        </w:rPr>
-        <w:t>Flowervillain18</w:t>
-      </w:r>
-      <w:r>
-        <w:rPr>
-          <w:rFonts w:ascii="Arial" w:hAnsi="Arial" w:cs="Arial"/>
-          <w:b/>
-          <w:bCs/>
-          <w:color w:val="000000"/>
-          <w:sz w:val="22"/>
-          <w:szCs w:val="22"/>
-        </w:rPr>
-        <w:t xml:space="preserve"> – whm22a</w:t>
+        <w:t>William Merrix: Flowervillain18 – whm22a</w:t>
       </w:r>
     </w:p>
     <w:p>
@@ -411,6 +299,25 @@
         <w:ind w:left="360"/>
         <w:rPr>
           <w:rFonts w:ascii="Times New Roman" w:eastAsia="Times New Roman" w:hAnsi="Times New Roman" w:cs="Times New Roman"/>
+        </w:rPr>
+      </w:pPr>
+      <w:r>
+        <w:rPr>
+          <w:rFonts w:ascii="Times New Roman" w:eastAsia="Times New Roman" w:hAnsi="Times New Roman" w:cs="Times New Roman"/>
+          <w:b/>
+          <w:bCs/>
+          <w:u w:val="single"/>
+        </w:rPr>
+        <w:t>Project: Seasons</w:t>
+      </w:r>
+    </w:p>
+    <w:p>
+      <w:pPr>
+        <w:pStyle w:val="ListParagraph"/>
+        <w:spacing w:before="120" w:after="120" w:line="240" w:lineRule="auto"/>
+        <w:ind w:left="360"/>
+        <w:rPr>
+          <w:rFonts w:ascii="Times New Roman" w:eastAsia="Times New Roman" w:hAnsi="Times New Roman" w:cs="Times New Roman"/>
           <w:b/>
           <w:bCs/>
           <w:sz w:val="11"/>
@@ -1083,7 +990,6 @@
           <w:bCs/>
           <w:i/>
         </w:rPr>
-        <w:lastRenderedPageBreak/>
         <w:t>More level Design – All</w:t>
       </w:r>
     </w:p>
@@ -1128,26 +1034,220 @@
         </w:rPr>
         <w:t>’</w:t>
       </w:r>
-    </w:p>
-    <w:p>
-      <w:pPr>
-        <w:pStyle w:val="ListParagraph"/>
-        <w:spacing w:before="120" w:after="120" w:line="240" w:lineRule="auto"/>
-        <w:ind w:left="360"/>
-        <w:rPr>
-          <w:rFonts w:ascii="Times New Roman" w:eastAsia="Times New Roman" w:hAnsi="Times New Roman" w:cs="Times New Roman"/>
-          <w:bCs/>
-          <w:iCs/>
-        </w:rPr>
-      </w:pPr>
-      <w:r>
-        <w:rPr>
-          <w:rFonts w:ascii="Times New Roman" w:eastAsia="Times New Roman" w:hAnsi="Times New Roman" w:cs="Times New Roman"/>
-          <w:bCs/>
-          <w:iCs/>
-        </w:rPr>
-        <w:t>We’ve Made the tutorial!</w:t>
-      </w:r>
+      <w:r>
+        <w:rPr>
+          <w:rFonts w:ascii="Times New Roman" w:eastAsia="Times New Roman" w:hAnsi="Times New Roman" w:cs="Times New Roman"/>
+          <w:b/>
+          <w:iCs/>
+        </w:rPr>
+        <w:br/>
+      </w:r>
+      <w:r>
+        <w:rPr>
+          <w:rFonts w:ascii="Times New Roman" w:eastAsia="Times New Roman" w:hAnsi="Times New Roman" w:cs="Times New Roman"/>
+          <w:b/>
+          <w:iCs/>
+        </w:rPr>
+        <w:t xml:space="preserve">subject: </w:t>
+      </w:r>
+      <w:r>
+        <w:rPr>
+          <w:rFonts w:ascii="Times New Roman" w:eastAsia="Times New Roman" w:hAnsi="Times New Roman" w:cs="Times New Roman"/>
+          <w:b/>
+          <w:iCs/>
+          <w:u w:val="single"/>
+        </w:rPr>
+        <w:t>Project: Seasons</w:t>
+      </w:r>
+      <w:r>
+        <w:rPr>
+          <w:rFonts w:ascii="Times New Roman" w:eastAsia="Times New Roman" w:hAnsi="Times New Roman" w:cs="Times New Roman"/>
+          <w:b/>
+          <w:iCs/>
+        </w:rPr>
+        <w:t xml:space="preserve"> progress report – first increment</w:t>
+      </w:r>
+    </w:p>
+    <w:p>
+      <w:pPr>
+        <w:pStyle w:val="ListParagraph"/>
+        <w:spacing w:before="120" w:after="120" w:line="240" w:lineRule="auto"/>
+        <w:ind w:left="360"/>
+        <w:rPr>
+          <w:rFonts w:ascii="Times New Roman" w:eastAsia="Times New Roman" w:hAnsi="Times New Roman" w:cs="Times New Roman"/>
+          <w:bCs/>
+          <w:iCs/>
+        </w:rPr>
+      </w:pPr>
+      <w:r>
+        <w:rPr>
+          <w:rFonts w:ascii="Times New Roman" w:eastAsia="Times New Roman" w:hAnsi="Times New Roman" w:cs="Times New Roman"/>
+          <w:bCs/>
+          <w:iCs/>
+        </w:rPr>
+        <w:lastRenderedPageBreak/>
+        <w:t>Hello [stakeholder],</w:t>
+      </w:r>
+    </w:p>
+    <w:p>
+      <w:pPr>
+        <w:pStyle w:val="ListParagraph"/>
+        <w:spacing w:before="120" w:after="120" w:line="240" w:lineRule="auto"/>
+        <w:ind w:left="360"/>
+        <w:rPr>
+          <w:rFonts w:ascii="Times New Roman" w:eastAsia="Times New Roman" w:hAnsi="Times New Roman" w:cs="Times New Roman"/>
+          <w:bCs/>
+          <w:iCs/>
+        </w:rPr>
+      </w:pPr>
+      <w:r>
+        <w:rPr>
+          <w:rFonts w:ascii="Times New Roman" w:eastAsia="Times New Roman" w:hAnsi="Times New Roman" w:cs="Times New Roman"/>
+          <w:bCs/>
+          <w:iCs/>
+        </w:rPr>
+        <w:tab/>
+        <w:t>We have been hard at work, thank you for your patience with our product. Our team has successfully completed the game design and basic logic</w:t>
+      </w:r>
+      <w:r>
+        <w:rPr>
+          <w:rFonts w:ascii="Times New Roman" w:eastAsia="Times New Roman" w:hAnsi="Times New Roman" w:cs="Times New Roman"/>
+          <w:bCs/>
+          <w:iCs/>
+        </w:rPr>
+        <w:t xml:space="preserve"> frameworks for the tutorial and level 1. We are also pleased to inform you we have a working main menu </w:t>
+      </w:r>
+      <w:r>
+        <w:rPr>
+          <w:rFonts w:ascii="Times New Roman" w:eastAsia="Times New Roman" w:hAnsi="Times New Roman" w:cs="Times New Roman"/>
+          <w:bCs/>
+          <w:iCs/>
+        </w:rPr>
+        <w:t>User Interface (</w:t>
+      </w:r>
+      <w:r>
+        <w:rPr>
+          <w:rFonts w:ascii="Times New Roman" w:eastAsia="Times New Roman" w:hAnsi="Times New Roman" w:cs="Times New Roman"/>
+          <w:bCs/>
+          <w:iCs/>
+        </w:rPr>
+        <w:t>UI</w:t>
+      </w:r>
+      <w:r>
+        <w:rPr>
+          <w:rFonts w:ascii="Times New Roman" w:eastAsia="Times New Roman" w:hAnsi="Times New Roman" w:cs="Times New Roman"/>
+          <w:bCs/>
+          <w:iCs/>
+        </w:rPr>
+        <w:t>)</w:t>
+      </w:r>
+      <w:r>
+        <w:rPr>
+          <w:rFonts w:ascii="Times New Roman" w:eastAsia="Times New Roman" w:hAnsi="Times New Roman" w:cs="Times New Roman"/>
+          <w:bCs/>
+          <w:iCs/>
+        </w:rPr>
+        <w:t xml:space="preserve"> prototype</w:t>
+      </w:r>
+      <w:r>
+        <w:rPr>
+          <w:rFonts w:ascii="Times New Roman" w:eastAsia="Times New Roman" w:hAnsi="Times New Roman" w:cs="Times New Roman"/>
+          <w:bCs/>
+          <w:iCs/>
+        </w:rPr>
+        <w:t xml:space="preserve"> (this </w:t>
+      </w:r>
+      <w:proofErr w:type="gramStart"/>
+      <w:r>
+        <w:rPr>
+          <w:rFonts w:ascii="Times New Roman" w:eastAsia="Times New Roman" w:hAnsi="Times New Roman" w:cs="Times New Roman"/>
+          <w:bCs/>
+          <w:iCs/>
+        </w:rPr>
+        <w:t>the</w:t>
+      </w:r>
+      <w:proofErr w:type="gramEnd"/>
+      <w:r>
+        <w:rPr>
+          <w:rFonts w:ascii="Times New Roman" w:eastAsia="Times New Roman" w:hAnsi="Times New Roman" w:cs="Times New Roman"/>
+          <w:bCs/>
+          <w:iCs/>
+        </w:rPr>
+        <w:t xml:space="preserve"> start menu)</w:t>
+      </w:r>
+      <w:r>
+        <w:rPr>
+          <w:rFonts w:ascii="Times New Roman" w:eastAsia="Times New Roman" w:hAnsi="Times New Roman" w:cs="Times New Roman"/>
+          <w:bCs/>
+          <w:iCs/>
+        </w:rPr>
+        <w:t>.</w:t>
+      </w:r>
+      <w:r>
+        <w:rPr>
+          <w:rFonts w:ascii="Times New Roman" w:eastAsia="Times New Roman" w:hAnsi="Times New Roman" w:cs="Times New Roman"/>
+          <w:bCs/>
+          <w:iCs/>
+        </w:rPr>
+        <w:t xml:space="preserve"> The team is progressing smoothly; we will update as more things come to fruition. Please don’t hesitate to reach out with any questions, comments, or concerns. </w:t>
+      </w:r>
+      <w:r>
+        <w:rPr>
+          <w:rFonts w:ascii="Times New Roman" w:eastAsia="Times New Roman" w:hAnsi="Times New Roman" w:cs="Times New Roman"/>
+          <w:bCs/>
+          <w:iCs/>
+        </w:rPr>
+        <w:t xml:space="preserve"> </w:t>
+      </w:r>
+      <w:r>
+        <w:rPr>
+          <w:rFonts w:ascii="Times New Roman" w:eastAsia="Times New Roman" w:hAnsi="Times New Roman" w:cs="Times New Roman"/>
+          <w:bCs/>
+          <w:iCs/>
+        </w:rPr>
+        <w:br/>
+      </w:r>
+    </w:p>
+    <w:p>
+      <w:pPr>
+        <w:pStyle w:val="ListParagraph"/>
+        <w:spacing w:before="120" w:after="120" w:line="240" w:lineRule="auto"/>
+        <w:ind w:left="360"/>
+        <w:rPr>
+          <w:rFonts w:ascii="Times New Roman" w:eastAsia="Times New Roman" w:hAnsi="Times New Roman" w:cs="Times New Roman"/>
+          <w:bCs/>
+          <w:iCs/>
+        </w:rPr>
+      </w:pPr>
+      <w:r>
+        <w:rPr>
+          <w:rFonts w:ascii="Times New Roman" w:eastAsia="Times New Roman" w:hAnsi="Times New Roman" w:cs="Times New Roman"/>
+          <w:bCs/>
+          <w:iCs/>
+        </w:rPr>
+        <w:t>Thank you,</w:t>
+      </w:r>
+      <w:r>
+        <w:rPr>
+          <w:rFonts w:ascii="Times New Roman" w:eastAsia="Times New Roman" w:hAnsi="Times New Roman" w:cs="Times New Roman"/>
+          <w:bCs/>
+          <w:iCs/>
+        </w:rPr>
+        <w:br/>
+        <w:t>--Team 22</w:t>
+      </w:r>
+    </w:p>
+    <w:p>
+      <w:pPr>
+        <w:pStyle w:val="ListParagraph"/>
+        <w:spacing w:before="120" w:after="120" w:line="240" w:lineRule="auto"/>
+        <w:ind w:left="360"/>
+        <w:rPr>
+          <w:rFonts w:ascii="Times New Roman" w:eastAsia="Times New Roman" w:hAnsi="Times New Roman" w:cs="Times New Roman"/>
+          <w:bCs/>
+          <w:iCs/>
+        </w:rPr>
+      </w:pPr>
     </w:p>
     <w:p>
       <w:pPr>

</xml_diff>

<commit_message>
updated progress report temporarily
</commit_message>
<xml_diff>
--- a/Documents/Progress Report Template.docx
+++ b/Documents/Progress Report Template.docx
@@ -447,112 +447,115 @@
         <w:ind w:left="360"/>
         <w:rPr>
           <w:rFonts w:ascii="Times New Roman" w:eastAsia="Times New Roman" w:hAnsi="Times New Roman" w:cs="Times New Roman"/>
-          <w:bCs/>
-          <w:iCs/>
-        </w:rPr>
-      </w:pPr>
-      <w:r>
-        <w:rPr>
-          <w:rFonts w:ascii="Times New Roman" w:eastAsia="Times New Roman" w:hAnsi="Times New Roman" w:cs="Times New Roman"/>
-          <w:bCs/>
-          <w:iCs/>
-        </w:rPr>
-        <w:t>Project issue trackers and goals were all set.</w:t>
-      </w:r>
-    </w:p>
-    <w:p>
-      <w:pPr>
-        <w:spacing w:before="120" w:after="120" w:line="240" w:lineRule="auto"/>
-        <w:ind w:left="360"/>
-        <w:rPr>
-          <w:rFonts w:ascii="Times New Roman" w:eastAsia="Times New Roman" w:hAnsi="Times New Roman" w:cs="Times New Roman"/>
-          <w:bCs/>
-          <w:iCs/>
-        </w:rPr>
-      </w:pPr>
-      <w:r>
-        <w:rPr>
-          <w:rFonts w:ascii="Times New Roman" w:eastAsia="Times New Roman" w:hAnsi="Times New Roman" w:cs="Times New Roman"/>
-          <w:bCs/>
-          <w:iCs/>
-        </w:rPr>
-        <w:t xml:space="preserve">Base level designs were </w:t>
-      </w:r>
-      <w:proofErr w:type="gramStart"/>
-      <w:r>
-        <w:rPr>
-          <w:rFonts w:ascii="Times New Roman" w:eastAsia="Times New Roman" w:hAnsi="Times New Roman" w:cs="Times New Roman"/>
-          <w:bCs/>
-          <w:iCs/>
-        </w:rPr>
-        <w:t>created</w:t>
-      </w:r>
-      <w:proofErr w:type="gramEnd"/>
-      <w:r>
-        <w:rPr>
-          <w:rFonts w:ascii="Times New Roman" w:eastAsia="Times New Roman" w:hAnsi="Times New Roman" w:cs="Times New Roman"/>
-          <w:bCs/>
-          <w:iCs/>
-        </w:rPr>
-        <w:t xml:space="preserve"> and some basic sprites were made. (see supporting files)</w:t>
-      </w:r>
-    </w:p>
-    <w:p>
-      <w:pPr>
-        <w:spacing w:before="120" w:after="120" w:line="240" w:lineRule="auto"/>
-        <w:ind w:left="360"/>
-        <w:rPr>
-          <w:rFonts w:ascii="Times New Roman" w:eastAsia="Times New Roman" w:hAnsi="Times New Roman" w:cs="Times New Roman"/>
-          <w:bCs/>
-          <w:iCs/>
-        </w:rPr>
-      </w:pPr>
-      <w:r>
-        <w:rPr>
-          <w:rFonts w:ascii="Times New Roman" w:eastAsia="Times New Roman" w:hAnsi="Times New Roman" w:cs="Times New Roman"/>
-          <w:bCs/>
-          <w:iCs/>
-        </w:rPr>
-        <w:t>Supporting documents created</w:t>
-      </w:r>
-    </w:p>
-    <w:p>
-      <w:pPr>
-        <w:spacing w:before="120" w:after="120" w:line="240" w:lineRule="auto"/>
-        <w:ind w:left="360"/>
-        <w:rPr>
-          <w:rFonts w:ascii="Times New Roman" w:eastAsia="Times New Roman" w:hAnsi="Times New Roman" w:cs="Times New Roman"/>
-          <w:bCs/>
-          <w:iCs/>
-        </w:rPr>
-      </w:pPr>
-      <w:r>
-        <w:rPr>
-          <w:rFonts w:ascii="Times New Roman" w:eastAsia="Times New Roman" w:hAnsi="Times New Roman" w:cs="Times New Roman"/>
-          <w:bCs/>
-          <w:iCs/>
-        </w:rPr>
-        <w:t>Empty scene made</w:t>
-      </w:r>
-    </w:p>
-    <w:p>
-      <w:pPr>
-        <w:spacing w:before="120" w:after="120" w:line="240" w:lineRule="auto"/>
-        <w:ind w:left="360"/>
-        <w:rPr>
-          <w:rFonts w:ascii="Times New Roman" w:eastAsia="Times New Roman" w:hAnsi="Times New Roman" w:cs="Times New Roman"/>
-          <w:bCs/>
-          <w:iCs/>
-        </w:rPr>
-      </w:pPr>
-      <w:r>
-        <w:rPr>
-          <w:rFonts w:ascii="Times New Roman" w:eastAsia="Times New Roman" w:hAnsi="Times New Roman" w:cs="Times New Roman"/>
-          <w:bCs/>
-          <w:iCs/>
-        </w:rPr>
-        <w:t>Early-level start screen made</w:t>
-      </w:r>
+          <w:b/>
+          <w:bCs/>
+          <w:iCs/>
+        </w:rPr>
+      </w:pPr>
+      <w:r>
+        <w:rPr>
+          <w:rFonts w:ascii="Times New Roman" w:eastAsia="Times New Roman" w:hAnsi="Times New Roman" w:cs="Times New Roman"/>
+          <w:b/>
+          <w:bCs/>
+          <w:iCs/>
+        </w:rPr>
+        <w:t>Title and main menu screen</w:t>
+      </w:r>
+    </w:p>
+    <w:p>
+      <w:pPr>
+        <w:spacing w:before="120" w:after="120" w:line="240" w:lineRule="auto"/>
+        <w:ind w:left="360"/>
+        <w:rPr>
+          <w:rFonts w:ascii="Times New Roman" w:eastAsia="Times New Roman" w:hAnsi="Times New Roman" w:cs="Times New Roman"/>
+          <w:b/>
+          <w:bCs/>
+          <w:iCs/>
+        </w:rPr>
+      </w:pPr>
+      <w:r>
+        <w:rPr>
+          <w:rFonts w:ascii="Times New Roman" w:eastAsia="Times New Roman" w:hAnsi="Times New Roman" w:cs="Times New Roman"/>
+          <w:b/>
+          <w:bCs/>
+          <w:iCs/>
+        </w:rPr>
+        <w:t>Tutorial Level</w:t>
+      </w:r>
+    </w:p>
+    <w:p>
+      <w:pPr>
+        <w:spacing w:before="120" w:after="120" w:line="240" w:lineRule="auto"/>
+        <w:ind w:left="360"/>
+        <w:rPr>
+          <w:rFonts w:ascii="Times New Roman" w:eastAsia="Times New Roman" w:hAnsi="Times New Roman" w:cs="Times New Roman"/>
+          <w:b/>
+          <w:bCs/>
+          <w:iCs/>
+        </w:rPr>
+      </w:pPr>
+      <w:r>
+        <w:rPr>
+          <w:rFonts w:ascii="Times New Roman" w:eastAsia="Times New Roman" w:hAnsi="Times New Roman" w:cs="Times New Roman"/>
+          <w:b/>
+          <w:bCs/>
+          <w:iCs/>
+        </w:rPr>
+        <w:t>New Sprites</w:t>
+      </w:r>
+    </w:p>
+    <w:p>
+      <w:pPr>
+        <w:spacing w:before="120" w:after="120" w:line="240" w:lineRule="auto"/>
+        <w:ind w:left="360"/>
+        <w:rPr>
+          <w:rFonts w:ascii="Times New Roman" w:eastAsia="Times New Roman" w:hAnsi="Times New Roman" w:cs="Times New Roman"/>
+          <w:b/>
+          <w:bCs/>
+          <w:iCs/>
+        </w:rPr>
+      </w:pPr>
+      <w:r>
+        <w:rPr>
+          <w:rFonts w:ascii="Times New Roman" w:eastAsia="Times New Roman" w:hAnsi="Times New Roman" w:cs="Times New Roman"/>
+          <w:b/>
+          <w:bCs/>
+          <w:iCs/>
+        </w:rPr>
+        <w:t>Base UI</w:t>
+      </w:r>
+    </w:p>
+    <w:p>
+      <w:pPr>
+        <w:spacing w:before="120" w:after="120" w:line="240" w:lineRule="auto"/>
+        <w:ind w:left="360"/>
+        <w:rPr>
+          <w:rFonts w:ascii="Times New Roman" w:eastAsia="Times New Roman" w:hAnsi="Times New Roman" w:cs="Times New Roman"/>
+          <w:b/>
+          <w:bCs/>
+          <w:iCs/>
+        </w:rPr>
+      </w:pPr>
+      <w:r>
+        <w:rPr>
+          <w:rFonts w:ascii="Times New Roman" w:eastAsia="Times New Roman" w:hAnsi="Times New Roman" w:cs="Times New Roman"/>
+          <w:b/>
+          <w:bCs/>
+          <w:iCs/>
+        </w:rPr>
+        <w:t>More base logic for game components</w:t>
+      </w:r>
+    </w:p>
+    <w:p>
+      <w:pPr>
+        <w:spacing w:before="120" w:after="120" w:line="240" w:lineRule="auto"/>
+        <w:rPr>
+          <w:rFonts w:ascii="Times New Roman" w:eastAsia="Times New Roman" w:hAnsi="Times New Roman" w:cs="Times New Roman"/>
+          <w:b/>
+          <w:bCs/>
+          <w:iCs/>
+        </w:rPr>
+      </w:pPr>
     </w:p>
     <w:p>
       <w:pPr>
@@ -579,6 +582,25 @@
     </w:p>
     <w:p>
       <w:pPr>
+        <w:spacing w:before="120" w:after="120" w:line="240" w:lineRule="auto"/>
+        <w:ind w:left="360"/>
+        <w:rPr>
+          <w:rFonts w:ascii="Times New Roman" w:eastAsia="Times New Roman" w:hAnsi="Times New Roman" w:cs="Times New Roman"/>
+          <w:b/>
+          <w:bCs/>
+        </w:rPr>
+      </w:pPr>
+      <w:r>
+        <w:rPr>
+          <w:rFonts w:ascii="Times New Roman" w:eastAsia="Times New Roman" w:hAnsi="Times New Roman" w:cs="Times New Roman"/>
+          <w:b/>
+          <w:bCs/>
+        </w:rPr>
+        <w:t>No significant changes in plan or scope of the project this increment.</w:t>
+      </w:r>
+    </w:p>
+    <w:p>
+      <w:pPr>
         <w:pStyle w:val="ListParagraph"/>
         <w:spacing w:before="120" w:after="120" w:line="240" w:lineRule="auto"/>
         <w:ind w:left="360"/>
@@ -598,44 +620,26 @@
         <w:ind w:left="360"/>
         <w:rPr>
           <w:rFonts w:ascii="Times New Roman" w:eastAsia="Times New Roman" w:hAnsi="Times New Roman" w:cs="Times New Roman"/>
-        </w:rPr>
-      </w:pPr>
-      <w:r>
-        <w:rPr>
-          <w:rFonts w:ascii="Times New Roman" w:eastAsia="Times New Roman" w:hAnsi="Times New Roman" w:cs="Times New Roman"/>
-        </w:rPr>
-        <w:t xml:space="preserve">Issue tracker from excel to </w:t>
-      </w:r>
-      <w:proofErr w:type="spellStart"/>
-      <w:r>
-        <w:rPr>
-          <w:rFonts w:ascii="Times New Roman" w:eastAsia="Times New Roman" w:hAnsi="Times New Roman" w:cs="Times New Roman"/>
-        </w:rPr>
-        <w:t>yaml</w:t>
-      </w:r>
-      <w:proofErr w:type="spellEnd"/>
-      <w:r>
-        <w:rPr>
-          <w:rFonts w:ascii="Times New Roman" w:eastAsia="Times New Roman" w:hAnsi="Times New Roman" w:cs="Times New Roman"/>
-        </w:rPr>
-        <w:t xml:space="preserve"> files was confusing.</w:t>
-      </w:r>
-    </w:p>
-    <w:p>
-      <w:pPr>
-        <w:pStyle w:val="ListParagraph"/>
-        <w:spacing w:before="120" w:after="120" w:line="240" w:lineRule="auto"/>
-        <w:ind w:left="360"/>
-        <w:rPr>
-          <w:rFonts w:ascii="Times New Roman" w:eastAsia="Times New Roman" w:hAnsi="Times New Roman" w:cs="Times New Roman"/>
-        </w:rPr>
-      </w:pPr>
-      <w:r>
-        <w:rPr>
-          <w:rFonts w:ascii="Times New Roman" w:eastAsia="Times New Roman" w:hAnsi="Times New Roman" w:cs="Times New Roman"/>
-        </w:rPr>
-        <w:t>Difficulty in organization in terms of establishing file structure</w:t>
-      </w:r>
+          <w:b/>
+          <w:bCs/>
+          <w:sz w:val="10"/>
+          <w:szCs w:val="10"/>
+        </w:rPr>
+      </w:pPr>
+    </w:p>
+    <w:p>
+      <w:pPr>
+        <w:pStyle w:val="ListParagraph"/>
+        <w:spacing w:before="120" w:after="120" w:line="240" w:lineRule="auto"/>
+        <w:ind w:left="360"/>
+        <w:rPr>
+          <w:rFonts w:ascii="Times New Roman" w:eastAsia="Times New Roman" w:hAnsi="Times New Roman" w:cs="Times New Roman"/>
+          <w:b/>
+          <w:bCs/>
+          <w:sz w:val="10"/>
+          <w:szCs w:val="10"/>
+        </w:rPr>
+      </w:pPr>
     </w:p>
     <w:p>
       <w:pPr>
@@ -764,7 +768,7 @@
           <w:bCs/>
           <w:iCs/>
         </w:rPr>
-        <w:t>Level 1 design and planning – Annie</w:t>
+        <w:t>Level 1 – Annie</w:t>
       </w:r>
     </w:p>
     <w:p>
@@ -843,7 +847,15 @@
           <w:bCs/>
           <w:iCs/>
         </w:rPr>
-        <w:t>Tutorial and dialogue – Annie</w:t>
+        <w:t xml:space="preserve">Tutorial </w:t>
+      </w:r>
+      <w:r>
+        <w:rPr>
+          <w:rFonts w:ascii="Times New Roman" w:eastAsia="Times New Roman" w:hAnsi="Times New Roman" w:cs="Times New Roman"/>
+          <w:bCs/>
+          <w:iCs/>
+        </w:rPr>
+        <w:t>- Will</w:t>
       </w:r>
     </w:p>
     <w:p>
@@ -866,29 +878,6 @@
           <w:bCs/>
           <w:iCs/>
         </w:rPr>
-        <w:t>Main menu (UI) – Will</w:t>
-      </w:r>
-    </w:p>
-    <w:p>
-      <w:pPr>
-        <w:pStyle w:val="ListParagraph"/>
-        <w:numPr>
-          <w:ilvl w:val="1"/>
-          <w:numId w:val="2"/>
-        </w:numPr>
-        <w:spacing w:before="120" w:after="120" w:line="240" w:lineRule="auto"/>
-        <w:rPr>
-          <w:rFonts w:ascii="Times New Roman" w:eastAsia="Times New Roman" w:hAnsi="Times New Roman" w:cs="Times New Roman"/>
-          <w:bCs/>
-          <w:i/>
-        </w:rPr>
-      </w:pPr>
-      <w:r>
-        <w:rPr>
-          <w:rFonts w:ascii="Times New Roman" w:eastAsia="Times New Roman" w:hAnsi="Times New Roman" w:cs="Times New Roman"/>
-          <w:bCs/>
-          <w:iCs/>
-        </w:rPr>
         <w:t>Game Functionality – Annie, Chris (basic logic)</w:t>
       </w:r>
     </w:p>
@@ -952,45 +941,69 @@
           <w:bCs/>
           <w:i/>
         </w:rPr>
-        <w:t>Back end of level 1 – Annie, Chris</w:t>
-      </w:r>
-    </w:p>
-    <w:p>
-      <w:pPr>
-        <w:spacing w:before="120" w:after="120" w:line="240" w:lineRule="auto"/>
-        <w:ind w:left="360"/>
+        <w:t>Polishing current levels – Annie, Will</w:t>
+      </w:r>
+      <w:r>
         <w:rPr>
           <w:rFonts w:ascii="Times New Roman" w:eastAsia="Times New Roman" w:hAnsi="Times New Roman" w:cs="Times New Roman"/>
           <w:bCs/>
           <w:i/>
         </w:rPr>
-      </w:pPr>
-      <w:r>
+        <w:t>, Chris</w:t>
+      </w:r>
+    </w:p>
+    <w:p>
+      <w:pPr>
+        <w:spacing w:before="120" w:after="120" w:line="240" w:lineRule="auto"/>
+        <w:ind w:left="360"/>
         <w:rPr>
           <w:rFonts w:ascii="Times New Roman" w:eastAsia="Times New Roman" w:hAnsi="Times New Roman" w:cs="Times New Roman"/>
           <w:bCs/>
           <w:i/>
         </w:rPr>
-        <w:t>Graphics – Nico, Caleb, Will</w:t>
-      </w:r>
-    </w:p>
-    <w:p>
-      <w:pPr>
-        <w:spacing w:before="120" w:after="120" w:line="240" w:lineRule="auto"/>
-        <w:ind w:left="360"/>
+      </w:pPr>
+      <w:r>
         <w:rPr>
           <w:rFonts w:ascii="Times New Roman" w:eastAsia="Times New Roman" w:hAnsi="Times New Roman" w:cs="Times New Roman"/>
           <w:bCs/>
           <w:i/>
         </w:rPr>
-      </w:pPr>
+        <w:t>Graphics – Nico, Caleb,</w:t>
+      </w:r>
       <w:r>
         <w:rPr>
           <w:rFonts w:ascii="Times New Roman" w:eastAsia="Times New Roman" w:hAnsi="Times New Roman" w:cs="Times New Roman"/>
           <w:bCs/>
           <w:i/>
         </w:rPr>
+        <w:t xml:space="preserve"> Will</w:t>
+      </w:r>
+    </w:p>
+    <w:p>
+      <w:pPr>
+        <w:spacing w:before="120" w:after="120" w:line="240" w:lineRule="auto"/>
+        <w:ind w:left="360"/>
+        <w:rPr>
+          <w:rFonts w:ascii="Times New Roman" w:eastAsia="Times New Roman" w:hAnsi="Times New Roman" w:cs="Times New Roman"/>
+          <w:bCs/>
+          <w:i/>
+        </w:rPr>
+      </w:pPr>
+      <w:r>
+        <w:rPr>
+          <w:rFonts w:ascii="Times New Roman" w:eastAsia="Times New Roman" w:hAnsi="Times New Roman" w:cs="Times New Roman"/>
+          <w:bCs/>
+          <w:i/>
+        </w:rPr>
         <w:t>More level Design – All</w:t>
+      </w:r>
+      <w:r>
+        <w:rPr>
+          <w:rFonts w:ascii="Times New Roman" w:eastAsia="Times New Roman" w:hAnsi="Times New Roman" w:cs="Times New Roman"/>
+          <w:bCs/>
+          <w:i/>
+        </w:rPr>
+        <w:t xml:space="preserve"> (each person should come up with one additional level)</w:t>
       </w:r>
     </w:p>
     <w:p>
@@ -1024,6 +1037,7 @@
           <w:b/>
           <w:iCs/>
         </w:rPr>
+        <w:lastRenderedPageBreak/>
         <w:t>Stakeholder Communication</w:t>
       </w:r>
       <w:r>
@@ -1085,7 +1099,6 @@
           <w:bCs/>
           <w:iCs/>
         </w:rPr>
-        <w:lastRenderedPageBreak/>
         <w:t>Hello [stakeholder],</w:t>
       </w:r>
     </w:p>
@@ -1107,55 +1120,41 @@
           <w:iCs/>
         </w:rPr>
         <w:tab/>
-        <w:t>We have been hard at work, thank you for your patience with our product. Our team has successfully completed the game design and basic logic</w:t>
-      </w:r>
-      <w:r>
-        <w:rPr>
-          <w:rFonts w:ascii="Times New Roman" w:eastAsia="Times New Roman" w:hAnsi="Times New Roman" w:cs="Times New Roman"/>
-          <w:bCs/>
-          <w:iCs/>
-        </w:rPr>
-        <w:t xml:space="preserve"> frameworks for the tutorial and level 1. We are also pleased to inform you we have a working main menu </w:t>
-      </w:r>
-      <w:r>
-        <w:rPr>
-          <w:rFonts w:ascii="Times New Roman" w:eastAsia="Times New Roman" w:hAnsi="Times New Roman" w:cs="Times New Roman"/>
-          <w:bCs/>
-          <w:iCs/>
-        </w:rPr>
-        <w:t>User Interface (</w:t>
-      </w:r>
-      <w:r>
-        <w:rPr>
-          <w:rFonts w:ascii="Times New Roman" w:eastAsia="Times New Roman" w:hAnsi="Times New Roman" w:cs="Times New Roman"/>
-          <w:bCs/>
-          <w:iCs/>
-        </w:rPr>
-        <w:t>UI</w:t>
-      </w:r>
-      <w:r>
-        <w:rPr>
-          <w:rFonts w:ascii="Times New Roman" w:eastAsia="Times New Roman" w:hAnsi="Times New Roman" w:cs="Times New Roman"/>
-          <w:bCs/>
-          <w:iCs/>
-        </w:rPr>
-        <w:t>)</w:t>
-      </w:r>
-      <w:r>
-        <w:rPr>
-          <w:rFonts w:ascii="Times New Roman" w:eastAsia="Times New Roman" w:hAnsi="Times New Roman" w:cs="Times New Roman"/>
-          <w:bCs/>
-          <w:iCs/>
-        </w:rPr>
-        <w:t xml:space="preserve"> prototype</w:t>
-      </w:r>
-      <w:r>
-        <w:rPr>
-          <w:rFonts w:ascii="Times New Roman" w:eastAsia="Times New Roman" w:hAnsi="Times New Roman" w:cs="Times New Roman"/>
-          <w:bCs/>
-          <w:iCs/>
-        </w:rPr>
-        <w:t xml:space="preserve"> (this the start menu)</w:t>
+        <w:t xml:space="preserve">We have been hard at work, thank you for your patience with our product. Our team has successfully completed </w:t>
+      </w:r>
+      <w:r>
+        <w:rPr>
+          <w:rFonts w:ascii="Times New Roman" w:eastAsia="Times New Roman" w:hAnsi="Times New Roman" w:cs="Times New Roman"/>
+          <w:bCs/>
+          <w:iCs/>
+        </w:rPr>
+        <w:t xml:space="preserve">the tutorial and level one, </w:t>
+      </w:r>
+      <w:proofErr w:type="gramStart"/>
+      <w:r>
+        <w:rPr>
+          <w:rFonts w:ascii="Times New Roman" w:eastAsia="Times New Roman" w:hAnsi="Times New Roman" w:cs="Times New Roman"/>
+          <w:bCs/>
+          <w:iCs/>
+        </w:rPr>
+        <w:t>We</w:t>
+      </w:r>
+      <w:proofErr w:type="gramEnd"/>
+      <w:r>
+        <w:rPr>
+          <w:rFonts w:ascii="Times New Roman" w:eastAsia="Times New Roman" w:hAnsi="Times New Roman" w:cs="Times New Roman"/>
+          <w:bCs/>
+          <w:iCs/>
+        </w:rPr>
+        <w:t xml:space="preserve"> have them fully functional and ready for early beta testing so that we can make sure standards are up to your liking</w:t>
+      </w:r>
+      <w:r>
+        <w:rPr>
+          <w:rFonts w:ascii="Times New Roman" w:eastAsia="Times New Roman" w:hAnsi="Times New Roman" w:cs="Times New Roman"/>
+          <w:bCs/>
+          <w:iCs/>
+        </w:rPr>
+        <w:t>, as well as more planned levels for the future</w:t>
       </w:r>
       <w:r>
         <w:rPr>
@@ -1281,40 +1280,6 @@
         </w:rPr>
         <w:br/>
       </w:r>
-      <w:hyperlink r:id="rId6" w:tgtFrame="_blank" w:tooltip="https://youtu.be/nP3uY-7aL8c" w:history="1">
-        <w:r>
-          <w:rPr>
-            <w:rStyle w:val="Hyperlink"/>
-            <w:rFonts w:ascii="Times New Roman" w:eastAsia="Times New Roman" w:hAnsi="Times New Roman" w:cs="Times New Roman"/>
-            <w:b/>
-            <w:i/>
-          </w:rPr>
-          <w:t>https://youtu.be/nP3uY-7aL8c</w:t>
-        </w:r>
-      </w:hyperlink>
-    </w:p>
-    <w:p>
-      <w:pPr>
-        <w:pStyle w:val="ListParagraph"/>
-        <w:spacing w:before="120" w:after="120"/>
-        <w:ind w:left="360"/>
-        <w:rPr>
-          <w:rFonts w:ascii="Times New Roman" w:eastAsia="Times New Roman" w:hAnsi="Times New Roman" w:cs="Times New Roman"/>
-          <w:b/>
-          <w:i/>
-        </w:rPr>
-      </w:pPr>
-      <w:hyperlink r:id="rId7" w:tgtFrame="_blank" w:history="1">
-        <w:r>
-          <w:rPr>
-            <w:rStyle w:val="Hyperlink"/>
-            <w:rFonts w:ascii="Times New Roman" w:eastAsia="Times New Roman" w:hAnsi="Times New Roman" w:cs="Times New Roman"/>
-            <w:b/>
-            <w:i/>
-          </w:rPr>
-          <w:t>YouTube</w:t>
-        </w:r>
-      </w:hyperlink>
     </w:p>
     <w:p>
       <w:pPr>
@@ -2168,6 +2133,7 @@
   <w:style w:type="character" w:default="1" w:styleId="DefaultParagraphFont">
     <w:name w:val="Default Paragraph Font"/>
     <w:uiPriority w:val="1"/>
+    <w:semiHidden/>
     <w:unhideWhenUsed/>
   </w:style>
   <w:style w:type="table" w:default="1" w:styleId="TableNormal">

</xml_diff>

<commit_message>
added video to progress report
</commit_message>
<xml_diff>
--- a/Documents/Progress Report Template.docx
+++ b/Documents/Progress Report Template.docx
@@ -1027,25 +1027,7 @@
           <w:bCs/>
           <w:i/>
         </w:rPr>
-        <w:t xml:space="preserve">Level </w:t>
-      </w:r>
-      <w:proofErr w:type="gramStart"/>
-      <w:r>
-        <w:rPr>
-          <w:rFonts w:ascii="Times New Roman" w:eastAsia="Times New Roman" w:hAnsi="Times New Roman" w:cs="Times New Roman"/>
-          <w:bCs/>
-          <w:i/>
-        </w:rPr>
-        <w:t>select</w:t>
-      </w:r>
-      <w:proofErr w:type="gramEnd"/>
-      <w:r>
-        <w:rPr>
-          <w:rFonts w:ascii="Times New Roman" w:eastAsia="Times New Roman" w:hAnsi="Times New Roman" w:cs="Times New Roman"/>
-          <w:bCs/>
-          <w:i/>
-        </w:rPr>
-        <w:t xml:space="preserve"> </w:t>
+        <w:t xml:space="preserve">Level select </w:t>
       </w:r>
       <w:r>
         <w:rPr>
@@ -1164,7 +1146,23 @@
           <w:b/>
           <w:iCs/>
         </w:rPr>
-        <w:t xml:space="preserve"> progress report – first increment</w:t>
+        <w:t xml:space="preserve"> progress report – </w:t>
+      </w:r>
+      <w:r>
+        <w:rPr>
+          <w:rFonts w:ascii="Times New Roman" w:eastAsia="Times New Roman" w:hAnsi="Times New Roman" w:cs="Times New Roman"/>
+          <w:b/>
+          <w:iCs/>
+        </w:rPr>
+        <w:t xml:space="preserve">Second </w:t>
+      </w:r>
+      <w:r>
+        <w:rPr>
+          <w:rFonts w:ascii="Times New Roman" w:eastAsia="Times New Roman" w:hAnsi="Times New Roman" w:cs="Times New Roman"/>
+          <w:b/>
+          <w:iCs/>
+        </w:rPr>
+        <w:t>increment</w:t>
       </w:r>
     </w:p>
     <w:p>
@@ -1223,23 +1221,13 @@
         </w:rPr>
         <w:t xml:space="preserve">, </w:t>
       </w:r>
-      <w:proofErr w:type="gramStart"/>
-      <w:r>
-        <w:rPr>
-          <w:rFonts w:ascii="Times New Roman" w:eastAsia="Times New Roman" w:hAnsi="Times New Roman" w:cs="Times New Roman"/>
-          <w:bCs/>
-          <w:iCs/>
-        </w:rPr>
-        <w:t>We</w:t>
-      </w:r>
-      <w:proofErr w:type="gramEnd"/>
-      <w:r>
-        <w:rPr>
-          <w:rFonts w:ascii="Times New Roman" w:eastAsia="Times New Roman" w:hAnsi="Times New Roman" w:cs="Times New Roman"/>
-          <w:bCs/>
-          <w:iCs/>
-        </w:rPr>
-        <w:t xml:space="preserve"> have </w:t>
+      <w:r>
+        <w:rPr>
+          <w:rFonts w:ascii="Times New Roman" w:eastAsia="Times New Roman" w:hAnsi="Times New Roman" w:cs="Times New Roman"/>
+          <w:bCs/>
+          <w:iCs/>
+        </w:rPr>
+        <w:t xml:space="preserve">We have </w:t>
       </w:r>
       <w:r>
         <w:rPr>
@@ -1295,43 +1283,7 @@
           <w:bCs/>
           <w:iCs/>
         </w:rPr>
-        <w:t xml:space="preserve">completing </w:t>
-      </w:r>
-      <w:proofErr w:type="gramStart"/>
-      <w:r>
-        <w:rPr>
-          <w:rFonts w:ascii="Times New Roman" w:eastAsia="Times New Roman" w:hAnsi="Times New Roman" w:cs="Times New Roman"/>
-          <w:bCs/>
-          <w:iCs/>
-        </w:rPr>
-        <w:t>the level</w:t>
-      </w:r>
-      <w:proofErr w:type="gramEnd"/>
-      <w:r>
-        <w:rPr>
-          <w:rFonts w:ascii="Times New Roman" w:eastAsia="Times New Roman" w:hAnsi="Times New Roman" w:cs="Times New Roman"/>
-          <w:bCs/>
-          <w:iCs/>
-        </w:rPr>
-        <w:t xml:space="preserve"> 1 as well as introducing and completing other levels. Furthermore, </w:t>
-      </w:r>
-      <w:proofErr w:type="gramStart"/>
-      <w:r>
-        <w:rPr>
-          <w:rFonts w:ascii="Times New Roman" w:eastAsia="Times New Roman" w:hAnsi="Times New Roman" w:cs="Times New Roman"/>
-          <w:bCs/>
-          <w:iCs/>
-        </w:rPr>
-        <w:t>We</w:t>
-      </w:r>
-      <w:proofErr w:type="gramEnd"/>
-      <w:r>
-        <w:rPr>
-          <w:rFonts w:ascii="Times New Roman" w:eastAsia="Times New Roman" w:hAnsi="Times New Roman" w:cs="Times New Roman"/>
-          <w:bCs/>
-          <w:iCs/>
-        </w:rPr>
-        <w:t xml:space="preserve"> have updated our plan slightly on the backend to primarily using </w:t>
+        <w:t xml:space="preserve">completing the level 1 as well as introducing and completing other levels. Furthermore, We have updated our plan slightly on the backend to primarily using </w:t>
       </w:r>
       <w:proofErr w:type="spellStart"/>
       <w:r>
@@ -1475,6 +1427,17 @@
         </w:rPr>
         <w:br/>
       </w:r>
+      <w:hyperlink r:id="rId6" w:tgtFrame="_blank" w:tooltip="https://youtu.be/vSO9vekWpEA" w:history="1">
+        <w:r>
+          <w:rPr>
+            <w:rStyle w:val="Hyperlink"/>
+            <w:rFonts w:ascii="Times New Roman" w:eastAsia="Times New Roman" w:hAnsi="Times New Roman" w:cs="Times New Roman"/>
+            <w:bCs/>
+            <w:i/>
+          </w:rPr>
+          <w:t>https://youtu.be/vSO9vekWpEA</w:t>
+        </w:r>
+      </w:hyperlink>
       <w:r>
         <w:rPr>
           <w:rFonts w:ascii="Times New Roman" w:eastAsia="Times New Roman" w:hAnsi="Times New Roman" w:cs="Times New Roman"/>
@@ -2451,7 +2414,6 @@
   <w:style w:type="character" w:default="1" w:styleId="DefaultParagraphFont">
     <w:name w:val="Default Paragraph Font"/>
     <w:uiPriority w:val="1"/>
-    <w:semiHidden/>
     <w:unhideWhenUsed/>
   </w:style>
   <w:style w:type="table" w:default="1" w:styleId="TableNormal">

</xml_diff>

<commit_message>
Update Progress Report Template.docx
</commit_message>
<xml_diff>
--- a/Documents/Progress Report Template.docx
+++ b/Documents/Progress Report Template.docx
@@ -75,7 +75,7 @@
           <w:b/>
           <w:sz w:val="24"/>
         </w:rPr>
-        <w:t>1</w:t>
+        <w:t>2</w:t>
       </w:r>
       <w:r>
         <w:rPr>
@@ -457,70 +457,91 @@
           <w:bCs/>
           <w:iCs/>
         </w:rPr>
-        <w:t>Tutorial Level</w:t>
-      </w:r>
-    </w:p>
-    <w:p>
-      <w:pPr>
-        <w:spacing w:before="120" w:after="120" w:line="240" w:lineRule="auto"/>
-        <w:ind w:left="360"/>
-        <w:rPr>
-          <w:rFonts w:ascii="Times New Roman" w:eastAsia="Times New Roman" w:hAnsi="Times New Roman" w:cs="Times New Roman"/>
-          <w:b/>
-          <w:bCs/>
-          <w:iCs/>
-        </w:rPr>
-      </w:pPr>
-      <w:r>
-        <w:rPr>
-          <w:rFonts w:ascii="Times New Roman" w:eastAsia="Times New Roman" w:hAnsi="Times New Roman" w:cs="Times New Roman"/>
-          <w:b/>
-          <w:bCs/>
-          <w:iCs/>
-        </w:rPr>
-        <w:t>New Sprites</w:t>
-      </w:r>
-    </w:p>
-    <w:p>
-      <w:pPr>
-        <w:spacing w:before="120" w:after="120" w:line="240" w:lineRule="auto"/>
-        <w:ind w:left="360"/>
-        <w:rPr>
-          <w:rFonts w:ascii="Times New Roman" w:eastAsia="Times New Roman" w:hAnsi="Times New Roman" w:cs="Times New Roman"/>
-          <w:b/>
-          <w:bCs/>
-          <w:iCs/>
-        </w:rPr>
-      </w:pPr>
-      <w:r>
-        <w:rPr>
-          <w:rFonts w:ascii="Times New Roman" w:eastAsia="Times New Roman" w:hAnsi="Times New Roman" w:cs="Times New Roman"/>
-          <w:b/>
-          <w:bCs/>
-          <w:iCs/>
-        </w:rPr>
-        <w:t>Base UI</w:t>
-      </w:r>
-    </w:p>
-    <w:p>
-      <w:pPr>
-        <w:spacing w:before="120" w:after="120" w:line="240" w:lineRule="auto"/>
-        <w:ind w:left="360"/>
-        <w:rPr>
-          <w:rFonts w:ascii="Times New Roman" w:eastAsia="Times New Roman" w:hAnsi="Times New Roman" w:cs="Times New Roman"/>
-          <w:b/>
-          <w:bCs/>
-          <w:iCs/>
-        </w:rPr>
-      </w:pPr>
-      <w:r>
-        <w:rPr>
-          <w:rFonts w:ascii="Times New Roman" w:eastAsia="Times New Roman" w:hAnsi="Times New Roman" w:cs="Times New Roman"/>
-          <w:b/>
-          <w:bCs/>
-          <w:iCs/>
-        </w:rPr>
-        <w:t>More base logic for game components</w:t>
+        <w:t>Final levels</w:t>
+      </w:r>
+    </w:p>
+    <w:p>
+      <w:pPr>
+        <w:spacing w:before="120" w:after="120" w:line="240" w:lineRule="auto"/>
+        <w:ind w:left="360"/>
+        <w:rPr>
+          <w:rFonts w:ascii="Times New Roman" w:eastAsia="Times New Roman" w:hAnsi="Times New Roman" w:cs="Times New Roman"/>
+          <w:b/>
+          <w:bCs/>
+          <w:iCs/>
+        </w:rPr>
+      </w:pPr>
+      <w:r>
+        <w:rPr>
+          <w:rFonts w:ascii="Times New Roman" w:eastAsia="Times New Roman" w:hAnsi="Times New Roman" w:cs="Times New Roman"/>
+          <w:b/>
+          <w:bCs/>
+          <w:iCs/>
+        </w:rPr>
+        <w:t>Settings menu</w:t>
+      </w:r>
+    </w:p>
+    <w:p>
+      <w:pPr>
+        <w:spacing w:before="120" w:after="120" w:line="240" w:lineRule="auto"/>
+        <w:ind w:left="360"/>
+        <w:rPr>
+          <w:rFonts w:ascii="Times New Roman" w:eastAsia="Times New Roman" w:hAnsi="Times New Roman" w:cs="Times New Roman"/>
+          <w:b/>
+          <w:bCs/>
+          <w:iCs/>
+        </w:rPr>
+      </w:pPr>
+      <w:r>
+        <w:rPr>
+          <w:rFonts w:ascii="Times New Roman" w:eastAsia="Times New Roman" w:hAnsi="Times New Roman" w:cs="Times New Roman"/>
+          <w:b/>
+          <w:bCs/>
+          <w:iCs/>
+        </w:rPr>
+        <w:t>Level select</w:t>
+      </w:r>
+    </w:p>
+    <w:p>
+      <w:pPr>
+        <w:spacing w:before="120" w:after="120" w:line="240" w:lineRule="auto"/>
+        <w:ind w:left="360"/>
+        <w:rPr>
+          <w:rFonts w:ascii="Times New Roman" w:eastAsia="Times New Roman" w:hAnsi="Times New Roman" w:cs="Times New Roman"/>
+          <w:b/>
+          <w:bCs/>
+          <w:iCs/>
+        </w:rPr>
+      </w:pPr>
+      <w:r>
+        <w:rPr>
+          <w:rFonts w:ascii="Times New Roman" w:eastAsia="Times New Roman" w:hAnsi="Times New Roman" w:cs="Times New Roman"/>
+          <w:b/>
+          <w:bCs/>
+          <w:iCs/>
+        </w:rPr>
+        <w:t>Polished object functionality</w:t>
+      </w:r>
+    </w:p>
+    <w:p>
+      <w:pPr>
+        <w:spacing w:before="120" w:after="120" w:line="240" w:lineRule="auto"/>
+        <w:ind w:left="360"/>
+        <w:rPr>
+          <w:rFonts w:ascii="Times New Roman" w:eastAsia="Times New Roman" w:hAnsi="Times New Roman" w:cs="Times New Roman"/>
+          <w:b/>
+          <w:bCs/>
+          <w:iCs/>
+        </w:rPr>
+      </w:pPr>
+      <w:r>
+        <w:rPr>
+          <w:rFonts w:ascii="Times New Roman" w:eastAsia="Times New Roman" w:hAnsi="Times New Roman" w:cs="Times New Roman"/>
+          <w:b/>
+          <w:bCs/>
+          <w:iCs/>
+        </w:rPr>
+        <w:t>Title screen</w:t>
       </w:r>
     </w:p>
     <w:p>
@@ -577,26 +598,8 @@
           <w:b/>
           <w:bCs/>
         </w:rPr>
-        <w:t xml:space="preserve">looking at switching from </w:t>
-      </w:r>
-      <w:r>
-        <w:rPr>
-          <w:rFonts w:ascii="Times New Roman" w:eastAsia="Times New Roman" w:hAnsi="Times New Roman" w:cs="Times New Roman"/>
-          <w:b/>
-          <w:bCs/>
-        </w:rPr>
-        <w:t xml:space="preserve">using any C++ to just solely using </w:t>
-      </w:r>
-      <w:proofErr w:type="spellStart"/>
-      <w:r>
-        <w:rPr>
-          <w:rFonts w:ascii="Times New Roman" w:eastAsia="Times New Roman" w:hAnsi="Times New Roman" w:cs="Times New Roman"/>
-          <w:b/>
-          <w:bCs/>
-        </w:rPr>
-        <w:t>GDscript</w:t>
-      </w:r>
-      <w:proofErr w:type="spellEnd"/>
+        <w:t>Small bugs with interactions between boxes and holes that needed to be fixed</w:t>
+      </w:r>
     </w:p>
     <w:p>
       <w:pPr>
@@ -704,191 +707,6 @@
     <w:p>
       <w:pPr>
         <w:pStyle w:val="ListParagraph"/>
-        <w:numPr>
-          <w:ilvl w:val="1"/>
-          <w:numId w:val="2"/>
-        </w:numPr>
-        <w:spacing w:before="120" w:after="120" w:line="240" w:lineRule="auto"/>
-        <w:rPr>
-          <w:rFonts w:ascii="Times New Roman" w:eastAsia="Times New Roman" w:hAnsi="Times New Roman" w:cs="Times New Roman"/>
-          <w:bCs/>
-          <w:i/>
-        </w:rPr>
-      </w:pPr>
-      <w:r>
-        <w:rPr>
-          <w:rFonts w:ascii="Times New Roman" w:eastAsia="Times New Roman" w:hAnsi="Times New Roman" w:cs="Times New Roman"/>
-          <w:bCs/>
-          <w:iCs/>
-        </w:rPr>
-        <w:t>Progress report – caleb</w:t>
-      </w:r>
-    </w:p>
-    <w:p>
-      <w:pPr>
-        <w:pStyle w:val="ListParagraph"/>
-        <w:numPr>
-          <w:ilvl w:val="1"/>
-          <w:numId w:val="2"/>
-        </w:numPr>
-        <w:spacing w:before="120" w:after="120" w:line="240" w:lineRule="auto"/>
-        <w:rPr>
-          <w:rFonts w:ascii="Times New Roman" w:eastAsia="Times New Roman" w:hAnsi="Times New Roman" w:cs="Times New Roman"/>
-          <w:bCs/>
-          <w:i/>
-        </w:rPr>
-      </w:pPr>
-      <w:r>
-        <w:rPr>
-          <w:rFonts w:ascii="Times New Roman" w:eastAsia="Times New Roman" w:hAnsi="Times New Roman" w:cs="Times New Roman"/>
-          <w:bCs/>
-          <w:iCs/>
-        </w:rPr>
-        <w:t>Issue Tracker – caleb</w:t>
-      </w:r>
-    </w:p>
-    <w:p>
-      <w:pPr>
-        <w:pStyle w:val="ListParagraph"/>
-        <w:numPr>
-          <w:ilvl w:val="1"/>
-          <w:numId w:val="2"/>
-        </w:numPr>
-        <w:spacing w:before="120" w:after="120" w:line="240" w:lineRule="auto"/>
-        <w:rPr>
-          <w:rFonts w:ascii="Times New Roman" w:eastAsia="Times New Roman" w:hAnsi="Times New Roman" w:cs="Times New Roman"/>
-          <w:bCs/>
-          <w:i/>
-        </w:rPr>
-      </w:pPr>
-      <w:r>
-        <w:rPr>
-          <w:rFonts w:ascii="Times New Roman" w:eastAsia="Times New Roman" w:hAnsi="Times New Roman" w:cs="Times New Roman"/>
-          <w:bCs/>
-          <w:iCs/>
-        </w:rPr>
-        <w:t>Level 1 – Annie</w:t>
-      </w:r>
-    </w:p>
-    <w:p>
-      <w:pPr>
-        <w:pStyle w:val="ListParagraph"/>
-        <w:numPr>
-          <w:ilvl w:val="1"/>
-          <w:numId w:val="2"/>
-        </w:numPr>
-        <w:spacing w:before="120" w:after="120" w:line="240" w:lineRule="auto"/>
-        <w:rPr>
-          <w:rFonts w:ascii="Times New Roman" w:eastAsia="Times New Roman" w:hAnsi="Times New Roman" w:cs="Times New Roman"/>
-          <w:bCs/>
-          <w:i/>
-        </w:rPr>
-      </w:pPr>
-      <w:r>
-        <w:rPr>
-          <w:rFonts w:ascii="Times New Roman" w:eastAsia="Times New Roman" w:hAnsi="Times New Roman" w:cs="Times New Roman"/>
-          <w:bCs/>
-          <w:iCs/>
-        </w:rPr>
-        <w:t xml:space="preserve">RD – </w:t>
-      </w:r>
-      <w:r>
-        <w:rPr>
-          <w:rFonts w:ascii="Times New Roman" w:eastAsia="Times New Roman" w:hAnsi="Times New Roman" w:cs="Times New Roman"/>
-          <w:bCs/>
-          <w:iCs/>
-        </w:rPr>
-        <w:t>Nico</w:t>
-      </w:r>
-    </w:p>
-    <w:p>
-      <w:pPr>
-        <w:pStyle w:val="ListParagraph"/>
-        <w:numPr>
-          <w:ilvl w:val="1"/>
-          <w:numId w:val="2"/>
-        </w:numPr>
-        <w:spacing w:before="120" w:after="120" w:line="240" w:lineRule="auto"/>
-        <w:rPr>
-          <w:rFonts w:ascii="Times New Roman" w:eastAsia="Times New Roman" w:hAnsi="Times New Roman" w:cs="Times New Roman"/>
-          <w:bCs/>
-          <w:i/>
-        </w:rPr>
-      </w:pPr>
-      <w:r>
-        <w:rPr>
-          <w:rFonts w:ascii="Times New Roman" w:eastAsia="Times New Roman" w:hAnsi="Times New Roman" w:cs="Times New Roman"/>
-          <w:bCs/>
-          <w:iCs/>
-        </w:rPr>
-        <w:t xml:space="preserve">IT – </w:t>
-      </w:r>
-      <w:r>
-        <w:rPr>
-          <w:rFonts w:ascii="Times New Roman" w:eastAsia="Times New Roman" w:hAnsi="Times New Roman" w:cs="Times New Roman"/>
-          <w:bCs/>
-          <w:iCs/>
-        </w:rPr>
-        <w:t>Chris</w:t>
-      </w:r>
-    </w:p>
-    <w:p>
-      <w:pPr>
-        <w:pStyle w:val="ListParagraph"/>
-        <w:numPr>
-          <w:ilvl w:val="1"/>
-          <w:numId w:val="2"/>
-        </w:numPr>
-        <w:spacing w:before="120" w:after="120" w:line="240" w:lineRule="auto"/>
-        <w:rPr>
-          <w:rFonts w:ascii="Times New Roman" w:eastAsia="Times New Roman" w:hAnsi="Times New Roman" w:cs="Times New Roman"/>
-          <w:bCs/>
-          <w:i/>
-        </w:rPr>
-      </w:pPr>
-      <w:r>
-        <w:rPr>
-          <w:rFonts w:ascii="Times New Roman" w:eastAsia="Times New Roman" w:hAnsi="Times New Roman" w:cs="Times New Roman"/>
-          <w:bCs/>
-          <w:iCs/>
-        </w:rPr>
-        <w:t xml:space="preserve">Tutorial </w:t>
-      </w:r>
-      <w:r>
-        <w:rPr>
-          <w:rFonts w:ascii="Times New Roman" w:eastAsia="Times New Roman" w:hAnsi="Times New Roman" w:cs="Times New Roman"/>
-          <w:bCs/>
-          <w:iCs/>
-        </w:rPr>
-        <w:t>- Will</w:t>
-      </w:r>
-    </w:p>
-    <w:p>
-      <w:pPr>
-        <w:pStyle w:val="ListParagraph"/>
-        <w:numPr>
-          <w:ilvl w:val="1"/>
-          <w:numId w:val="2"/>
-        </w:numPr>
-        <w:spacing w:before="120" w:after="120" w:line="240" w:lineRule="auto"/>
-        <w:rPr>
-          <w:rFonts w:ascii="Times New Roman" w:eastAsia="Times New Roman" w:hAnsi="Times New Roman" w:cs="Times New Roman"/>
-          <w:bCs/>
-          <w:i/>
-        </w:rPr>
-      </w:pPr>
-      <w:r>
-        <w:rPr>
-          <w:rFonts w:ascii="Times New Roman" w:eastAsia="Times New Roman" w:hAnsi="Times New Roman" w:cs="Times New Roman"/>
-          <w:bCs/>
-          <w:iCs/>
-        </w:rPr>
-        <w:t>Game Functionality – Annie (basic logic)</w:t>
-      </w:r>
-    </w:p>
-    <w:p>
-      <w:pPr>
-        <w:pStyle w:val="ListParagraph"/>
         <w:spacing w:before="120" w:after="120" w:line="240" w:lineRule="auto"/>
         <w:rPr>
           <w:rFonts w:ascii="Times New Roman" w:eastAsia="Times New Roman" w:hAnsi="Times New Roman" w:cs="Times New Roman"/>
@@ -896,6 +714,176 @@
           <w:i/>
           <w:sz w:val="13"/>
           <w:szCs w:val="13"/>
+        </w:rPr>
+      </w:pPr>
+    </w:p>
+    <w:p>
+      <w:pPr>
+        <w:spacing w:before="120" w:after="120" w:line="240" w:lineRule="auto"/>
+        <w:ind w:left="360"/>
+        <w:rPr>
+          <w:rFonts w:ascii="Times New Roman" w:eastAsia="Times New Roman" w:hAnsi="Times New Roman" w:cs="Times New Roman"/>
+          <w:bCs/>
+          <w:i/>
+        </w:rPr>
+      </w:pPr>
+      <w:r>
+        <w:rPr>
+          <w:rFonts w:ascii="Times New Roman" w:eastAsia="Times New Roman" w:hAnsi="Times New Roman" w:cs="Times New Roman"/>
+          <w:bCs/>
+          <w:i/>
+        </w:rPr>
+        <w:t>Polishing current levels – Annie, Will</w:t>
+      </w:r>
+      <w:r>
+        <w:rPr>
+          <w:rFonts w:ascii="Times New Roman" w:eastAsia="Times New Roman" w:hAnsi="Times New Roman" w:cs="Times New Roman"/>
+          <w:bCs/>
+          <w:i/>
+        </w:rPr>
+        <w:t>, Chris</w:t>
+      </w:r>
+    </w:p>
+    <w:p>
+      <w:pPr>
+        <w:spacing w:before="120" w:after="120" w:line="240" w:lineRule="auto"/>
+        <w:ind w:left="360"/>
+        <w:rPr>
+          <w:rFonts w:ascii="Times New Roman" w:eastAsia="Times New Roman" w:hAnsi="Times New Roman" w:cs="Times New Roman"/>
+          <w:bCs/>
+          <w:i/>
+        </w:rPr>
+      </w:pPr>
+      <w:r>
+        <w:rPr>
+          <w:rFonts w:ascii="Times New Roman" w:eastAsia="Times New Roman" w:hAnsi="Times New Roman" w:cs="Times New Roman"/>
+          <w:bCs/>
+          <w:i/>
+        </w:rPr>
+        <w:t>Graphics – Nico</w:t>
+      </w:r>
+      <w:r>
+        <w:rPr>
+          <w:rFonts w:ascii="Times New Roman" w:eastAsia="Times New Roman" w:hAnsi="Times New Roman" w:cs="Times New Roman"/>
+          <w:bCs/>
+          <w:i/>
+        </w:rPr>
+        <w:t xml:space="preserve"> </w:t>
+      </w:r>
+      <w:r>
+        <w:rPr>
+          <w:rFonts w:ascii="Times New Roman" w:eastAsia="Times New Roman" w:hAnsi="Times New Roman" w:cs="Times New Roman"/>
+          <w:bCs/>
+          <w:i/>
+        </w:rPr>
+        <w:t>,</w:t>
+      </w:r>
+      <w:r>
+        <w:rPr>
+          <w:rFonts w:ascii="Times New Roman" w:eastAsia="Times New Roman" w:hAnsi="Times New Roman" w:cs="Times New Roman"/>
+          <w:bCs/>
+          <w:i/>
+        </w:rPr>
+        <w:t xml:space="preserve"> Will</w:t>
+      </w:r>
+    </w:p>
+    <w:p>
+      <w:pPr>
+        <w:spacing w:before="120" w:after="120" w:line="240" w:lineRule="auto"/>
+        <w:ind w:left="360"/>
+        <w:rPr>
+          <w:rFonts w:ascii="Times New Roman" w:eastAsia="Times New Roman" w:hAnsi="Times New Roman" w:cs="Times New Roman"/>
+          <w:bCs/>
+          <w:i/>
+        </w:rPr>
+      </w:pPr>
+      <w:r>
+        <w:rPr>
+          <w:rFonts w:ascii="Times New Roman" w:eastAsia="Times New Roman" w:hAnsi="Times New Roman" w:cs="Times New Roman"/>
+          <w:bCs/>
+          <w:i/>
+        </w:rPr>
+        <w:t>More level Design – All</w:t>
+      </w:r>
+      <w:r>
+        <w:rPr>
+          <w:rFonts w:ascii="Times New Roman" w:eastAsia="Times New Roman" w:hAnsi="Times New Roman" w:cs="Times New Roman"/>
+          <w:bCs/>
+          <w:i/>
+        </w:rPr>
+        <w:t xml:space="preserve"> </w:t>
+      </w:r>
+    </w:p>
+    <w:p>
+      <w:pPr>
+        <w:spacing w:before="120" w:after="120" w:line="240" w:lineRule="auto"/>
+        <w:ind w:left="360"/>
+        <w:rPr>
+          <w:rFonts w:ascii="Times New Roman" w:eastAsia="Times New Roman" w:hAnsi="Times New Roman" w:cs="Times New Roman"/>
+          <w:bCs/>
+          <w:i/>
+        </w:rPr>
+      </w:pPr>
+      <w:r>
+        <w:rPr>
+          <w:rFonts w:ascii="Times New Roman" w:eastAsia="Times New Roman" w:hAnsi="Times New Roman" w:cs="Times New Roman"/>
+          <w:bCs/>
+          <w:i/>
+        </w:rPr>
+        <w:t xml:space="preserve">Level select </w:t>
+      </w:r>
+      <w:r>
+        <w:rPr>
+          <w:rFonts w:ascii="Times New Roman" w:eastAsia="Times New Roman" w:hAnsi="Times New Roman" w:cs="Times New Roman"/>
+          <w:bCs/>
+          <w:i/>
+        </w:rPr>
+        <w:t>–</w:t>
+      </w:r>
+      <w:r>
+        <w:rPr>
+          <w:rFonts w:ascii="Times New Roman" w:eastAsia="Times New Roman" w:hAnsi="Times New Roman" w:cs="Times New Roman"/>
+          <w:bCs/>
+          <w:i/>
+        </w:rPr>
+        <w:t xml:space="preserve"> </w:t>
+      </w:r>
+      <w:r>
+        <w:rPr>
+          <w:rFonts w:ascii="Times New Roman" w:eastAsia="Times New Roman" w:hAnsi="Times New Roman" w:cs="Times New Roman"/>
+          <w:bCs/>
+          <w:i/>
+        </w:rPr>
+        <w:t>Caleb</w:t>
+      </w:r>
+    </w:p>
+    <w:p>
+      <w:pPr>
+        <w:spacing w:before="120" w:after="120" w:line="240" w:lineRule="auto"/>
+        <w:ind w:left="360"/>
+        <w:rPr>
+          <w:rFonts w:ascii="Times New Roman" w:eastAsia="Times New Roman" w:hAnsi="Times New Roman" w:cs="Times New Roman"/>
+          <w:bCs/>
+          <w:i/>
+        </w:rPr>
+      </w:pPr>
+      <w:r>
+        <w:rPr>
+          <w:rFonts w:ascii="Times New Roman" w:eastAsia="Times New Roman" w:hAnsi="Times New Roman" w:cs="Times New Roman"/>
+          <w:bCs/>
+          <w:i/>
+        </w:rPr>
+        <w:t xml:space="preserve">Settings – Nico </w:t>
+      </w:r>
+    </w:p>
+    <w:p>
+      <w:pPr>
+        <w:spacing w:before="120" w:after="120" w:line="240" w:lineRule="auto"/>
+        <w:ind w:left="360"/>
+        <w:rPr>
+          <w:rFonts w:ascii="Times New Roman" w:eastAsia="Times New Roman" w:hAnsi="Times New Roman" w:cs="Times New Roman"/>
+          <w:bCs/>
+          <w:i/>
         </w:rPr>
       </w:pPr>
     </w:p>
@@ -910,138 +898,233 @@
         <w:rPr>
           <w:rFonts w:ascii="Times New Roman" w:eastAsia="Times New Roman" w:hAnsi="Times New Roman" w:cs="Times New Roman"/>
           <w:b/>
-          <w:bCs/>
-        </w:rPr>
-      </w:pPr>
-      <w:r>
-        <w:rPr>
-          <w:rFonts w:ascii="Times New Roman" w:eastAsia="Times New Roman" w:hAnsi="Times New Roman" w:cs="Times New Roman"/>
-          <w:b/>
-          <w:bCs/>
-        </w:rPr>
-        <w:t xml:space="preserve">Plans for the next </w:t>
-      </w:r>
-      <w:r>
-        <w:rPr>
-          <w:rFonts w:ascii="Times New Roman" w:eastAsia="Times New Roman" w:hAnsi="Times New Roman" w:cs="Times New Roman"/>
-          <w:b/>
-          <w:bCs/>
+          <w:iCs/>
+        </w:rPr>
+      </w:pPr>
+      <w:r>
+        <w:rPr>
+          <w:rFonts w:ascii="Times New Roman" w:eastAsia="Times New Roman" w:hAnsi="Times New Roman" w:cs="Times New Roman"/>
+          <w:b/>
+          <w:iCs/>
+        </w:rPr>
+        <w:t>Stakeholder Communication</w:t>
+      </w:r>
+      <w:r>
+        <w:rPr>
+          <w:rFonts w:ascii="Times New Roman" w:eastAsia="Times New Roman" w:hAnsi="Times New Roman" w:cs="Times New Roman"/>
+          <w:b/>
+          <w:iCs/>
+        </w:rPr>
+        <w:t>’</w:t>
+      </w:r>
+      <w:r>
+        <w:rPr>
+          <w:rFonts w:ascii="Times New Roman" w:eastAsia="Times New Roman" w:hAnsi="Times New Roman" w:cs="Times New Roman"/>
+          <w:b/>
+          <w:iCs/>
+        </w:rPr>
+        <w:br/>
+      </w:r>
+      <w:r>
+        <w:rPr>
+          <w:rFonts w:ascii="Times New Roman" w:eastAsia="Times New Roman" w:hAnsi="Times New Roman" w:cs="Times New Roman"/>
+          <w:b/>
+          <w:iCs/>
+        </w:rPr>
+        <w:t xml:space="preserve">subject: </w:t>
+      </w:r>
+      <w:r>
+        <w:rPr>
+          <w:rFonts w:ascii="Times New Roman" w:eastAsia="Times New Roman" w:hAnsi="Times New Roman" w:cs="Times New Roman"/>
+          <w:b/>
+          <w:iCs/>
+          <w:u w:val="single"/>
+        </w:rPr>
+        <w:t>Project: Seasons</w:t>
+      </w:r>
+      <w:r>
+        <w:rPr>
+          <w:rFonts w:ascii="Times New Roman" w:eastAsia="Times New Roman" w:hAnsi="Times New Roman" w:cs="Times New Roman"/>
+          <w:b/>
+          <w:iCs/>
+        </w:rPr>
+        <w:t xml:space="preserve"> progress report – </w:t>
+      </w:r>
+      <w:r>
+        <w:rPr>
+          <w:rFonts w:ascii="Times New Roman" w:eastAsia="Times New Roman" w:hAnsi="Times New Roman" w:cs="Times New Roman"/>
+          <w:b/>
+          <w:iCs/>
+        </w:rPr>
+        <w:t xml:space="preserve">Second </w:t>
+      </w:r>
+      <w:r>
+        <w:rPr>
+          <w:rFonts w:ascii="Times New Roman" w:eastAsia="Times New Roman" w:hAnsi="Times New Roman" w:cs="Times New Roman"/>
+          <w:b/>
+          <w:iCs/>
         </w:rPr>
         <w:t>increment</w:t>
       </w:r>
     </w:p>
     <w:p>
       <w:pPr>
-        <w:spacing w:before="120" w:after="120" w:line="240" w:lineRule="auto"/>
-        <w:ind w:left="360"/>
-        <w:rPr>
-          <w:rFonts w:ascii="Times New Roman" w:eastAsia="Times New Roman" w:hAnsi="Times New Roman" w:cs="Times New Roman"/>
-          <w:bCs/>
-          <w:i/>
-        </w:rPr>
-      </w:pPr>
-      <w:r>
-        <w:rPr>
-          <w:rFonts w:ascii="Times New Roman" w:eastAsia="Times New Roman" w:hAnsi="Times New Roman" w:cs="Times New Roman"/>
-          <w:bCs/>
-          <w:i/>
-        </w:rPr>
-        <w:t>Polishing current levels – Annie, Will</w:t>
-      </w:r>
-      <w:r>
-        <w:rPr>
-          <w:rFonts w:ascii="Times New Roman" w:eastAsia="Times New Roman" w:hAnsi="Times New Roman" w:cs="Times New Roman"/>
-          <w:bCs/>
-          <w:i/>
-        </w:rPr>
-        <w:t>, Chris</w:t>
-      </w:r>
-    </w:p>
-    <w:p>
-      <w:pPr>
-        <w:spacing w:before="120" w:after="120" w:line="240" w:lineRule="auto"/>
-        <w:ind w:left="360"/>
-        <w:rPr>
-          <w:rFonts w:ascii="Times New Roman" w:eastAsia="Times New Roman" w:hAnsi="Times New Roman" w:cs="Times New Roman"/>
-          <w:bCs/>
-          <w:i/>
-        </w:rPr>
-      </w:pPr>
-      <w:r>
-        <w:rPr>
-          <w:rFonts w:ascii="Times New Roman" w:eastAsia="Times New Roman" w:hAnsi="Times New Roman" w:cs="Times New Roman"/>
-          <w:bCs/>
-          <w:i/>
-        </w:rPr>
-        <w:t>Graphics – Nico, Caleb,</w:t>
-      </w:r>
-      <w:r>
-        <w:rPr>
-          <w:rFonts w:ascii="Times New Roman" w:eastAsia="Times New Roman" w:hAnsi="Times New Roman" w:cs="Times New Roman"/>
-          <w:bCs/>
-          <w:i/>
-        </w:rPr>
-        <w:t xml:space="preserve"> Will</w:t>
-      </w:r>
-    </w:p>
-    <w:p>
-      <w:pPr>
-        <w:spacing w:before="120" w:after="120" w:line="240" w:lineRule="auto"/>
-        <w:ind w:left="360"/>
-        <w:rPr>
-          <w:rFonts w:ascii="Times New Roman" w:eastAsia="Times New Roman" w:hAnsi="Times New Roman" w:cs="Times New Roman"/>
-          <w:bCs/>
-          <w:i/>
-        </w:rPr>
-      </w:pPr>
-      <w:r>
-        <w:rPr>
-          <w:rFonts w:ascii="Times New Roman" w:eastAsia="Times New Roman" w:hAnsi="Times New Roman" w:cs="Times New Roman"/>
-          <w:bCs/>
-          <w:i/>
-        </w:rPr>
-        <w:t>More level Design – All</w:t>
-      </w:r>
-      <w:r>
-        <w:rPr>
-          <w:rFonts w:ascii="Times New Roman" w:eastAsia="Times New Roman" w:hAnsi="Times New Roman" w:cs="Times New Roman"/>
-          <w:bCs/>
-          <w:i/>
-        </w:rPr>
-        <w:t xml:space="preserve"> (each person should come up with one additional level)</w:t>
-      </w:r>
-    </w:p>
-    <w:p>
-      <w:pPr>
-        <w:spacing w:before="120" w:after="120" w:line="240" w:lineRule="auto"/>
-        <w:ind w:left="360"/>
-        <w:rPr>
-          <w:rFonts w:ascii="Times New Roman" w:eastAsia="Times New Roman" w:hAnsi="Times New Roman" w:cs="Times New Roman"/>
-          <w:bCs/>
-          <w:i/>
-        </w:rPr>
-      </w:pPr>
-      <w:r>
-        <w:rPr>
-          <w:rFonts w:ascii="Times New Roman" w:eastAsia="Times New Roman" w:hAnsi="Times New Roman" w:cs="Times New Roman"/>
-          <w:bCs/>
-          <w:i/>
-        </w:rPr>
-        <w:t xml:space="preserve">Level select </w:t>
-      </w:r>
-      <w:r>
-        <w:rPr>
-          <w:rFonts w:ascii="Times New Roman" w:eastAsia="Times New Roman" w:hAnsi="Times New Roman" w:cs="Times New Roman"/>
-          <w:bCs/>
-          <w:i/>
-        </w:rPr>
-        <w:t>–</w:t>
-      </w:r>
-      <w:r>
-        <w:rPr>
-          <w:rFonts w:ascii="Times New Roman" w:eastAsia="Times New Roman" w:hAnsi="Times New Roman" w:cs="Times New Roman"/>
-          <w:bCs/>
-          <w:i/>
+        <w:pStyle w:val="ListParagraph"/>
+        <w:spacing w:before="120" w:after="120" w:line="240" w:lineRule="auto"/>
+        <w:ind w:left="360"/>
+        <w:rPr>
+          <w:rFonts w:ascii="Times New Roman" w:eastAsia="Times New Roman" w:hAnsi="Times New Roman" w:cs="Times New Roman"/>
+          <w:bCs/>
+          <w:iCs/>
+        </w:rPr>
+      </w:pPr>
+      <w:r>
+        <w:rPr>
+          <w:rFonts w:ascii="Times New Roman" w:eastAsia="Times New Roman" w:hAnsi="Times New Roman" w:cs="Times New Roman"/>
+          <w:bCs/>
+          <w:iCs/>
+        </w:rPr>
+        <w:t>Hello [stakeholder],</w:t>
+      </w:r>
+    </w:p>
+    <w:p>
+      <w:pPr>
+        <w:pStyle w:val="ListParagraph"/>
+        <w:spacing w:before="120" w:after="120" w:line="240" w:lineRule="auto"/>
+        <w:ind w:left="360"/>
+        <w:rPr>
+          <w:rFonts w:ascii="Times New Roman" w:eastAsia="Times New Roman" w:hAnsi="Times New Roman" w:cs="Times New Roman"/>
+          <w:bCs/>
+          <w:iCs/>
+        </w:rPr>
+      </w:pPr>
+      <w:r>
+        <w:rPr>
+          <w:rFonts w:ascii="Times New Roman" w:eastAsia="Times New Roman" w:hAnsi="Times New Roman" w:cs="Times New Roman"/>
+          <w:bCs/>
+          <w:iCs/>
+        </w:rPr>
+        <w:tab/>
+        <w:t xml:space="preserve">We have been hard at work, thank you for your patience with our product. Our team has successfully completed </w:t>
+      </w:r>
+      <w:r>
+        <w:rPr>
+          <w:rFonts w:ascii="Times New Roman" w:eastAsia="Times New Roman" w:hAnsi="Times New Roman" w:cs="Times New Roman"/>
+          <w:bCs/>
+          <w:iCs/>
+        </w:rPr>
+        <w:t xml:space="preserve">the </w:t>
+      </w:r>
+      <w:r>
+        <w:rPr>
+          <w:rFonts w:ascii="Times New Roman" w:eastAsia="Times New Roman" w:hAnsi="Times New Roman" w:cs="Times New Roman"/>
+          <w:bCs/>
+          <w:iCs/>
+        </w:rPr>
+        <w:t>all levels for a demo</w:t>
+      </w:r>
+      <w:r>
+        <w:rPr>
+          <w:rFonts w:ascii="Times New Roman" w:eastAsia="Times New Roman" w:hAnsi="Times New Roman" w:cs="Times New Roman"/>
+          <w:bCs/>
+          <w:iCs/>
+        </w:rPr>
+        <w:t xml:space="preserve">, </w:t>
+      </w:r>
+      <w:r>
+        <w:rPr>
+          <w:rFonts w:ascii="Times New Roman" w:eastAsia="Times New Roman" w:hAnsi="Times New Roman" w:cs="Times New Roman"/>
+          <w:bCs/>
+          <w:iCs/>
+        </w:rPr>
+        <w:t xml:space="preserve">We have </w:t>
+      </w:r>
+      <w:r>
+        <w:rPr>
+          <w:rFonts w:ascii="Times New Roman" w:eastAsia="Times New Roman" w:hAnsi="Times New Roman" w:cs="Times New Roman"/>
+          <w:bCs/>
+          <w:iCs/>
+        </w:rPr>
+        <w:t>it</w:t>
+      </w:r>
+      <w:r>
+        <w:rPr>
+          <w:rFonts w:ascii="Times New Roman" w:eastAsia="Times New Roman" w:hAnsi="Times New Roman" w:cs="Times New Roman"/>
+          <w:bCs/>
+          <w:iCs/>
+        </w:rPr>
+        <w:t xml:space="preserve"> fully functional and ready for early beta testing so that we can make sure standards are up to your liking</w:t>
+      </w:r>
+      <w:r>
+        <w:rPr>
+          <w:rFonts w:ascii="Times New Roman" w:eastAsia="Times New Roman" w:hAnsi="Times New Roman" w:cs="Times New Roman"/>
+          <w:bCs/>
+          <w:iCs/>
+        </w:rPr>
+        <w:t>.</w:t>
+      </w:r>
+      <w:r>
+        <w:rPr>
+          <w:rFonts w:ascii="Times New Roman" w:eastAsia="Times New Roman" w:hAnsi="Times New Roman" w:cs="Times New Roman"/>
+          <w:bCs/>
+          <w:iCs/>
+        </w:rPr>
+        <w:t xml:space="preserve"> The team </w:t>
+      </w:r>
+      <w:r>
+        <w:rPr>
+          <w:rFonts w:ascii="Times New Roman" w:eastAsia="Times New Roman" w:hAnsi="Times New Roman" w:cs="Times New Roman"/>
+          <w:bCs/>
+          <w:iCs/>
+        </w:rPr>
+        <w:t>has progressed smoothly.</w:t>
+      </w:r>
+      <w:r>
+        <w:rPr>
+          <w:rFonts w:ascii="Times New Roman" w:eastAsia="Times New Roman" w:hAnsi="Times New Roman" w:cs="Times New Roman"/>
+          <w:bCs/>
+          <w:iCs/>
+        </w:rPr>
+        <w:t xml:space="preserve"> Furthermore, We have updated </w:t>
+      </w:r>
+      <w:r>
+        <w:rPr>
+          <w:rFonts w:ascii="Times New Roman" w:eastAsia="Times New Roman" w:hAnsi="Times New Roman" w:cs="Times New Roman"/>
+          <w:bCs/>
+          <w:iCs/>
+        </w:rPr>
+        <w:lastRenderedPageBreak/>
+        <w:t>some small logic</w:t>
+      </w:r>
+      <w:r>
+        <w:rPr>
+          <w:rFonts w:ascii="Times New Roman" w:eastAsia="Times New Roman" w:hAnsi="Times New Roman" w:cs="Times New Roman"/>
+          <w:bCs/>
+          <w:iCs/>
+        </w:rPr>
+        <w:t xml:space="preserve"> slightly on the backend to </w:t>
+      </w:r>
+      <w:r>
+        <w:rPr>
+          <w:rFonts w:ascii="Times New Roman" w:eastAsia="Times New Roman" w:hAnsi="Times New Roman" w:cs="Times New Roman"/>
+          <w:bCs/>
+          <w:iCs/>
+        </w:rPr>
+        <w:t xml:space="preserve">fix existing bugs between object interactions. </w:t>
+      </w:r>
+      <w:r>
+        <w:rPr>
+          <w:rFonts w:ascii="Times New Roman" w:eastAsia="Times New Roman" w:hAnsi="Times New Roman" w:cs="Times New Roman"/>
+          <w:bCs/>
+          <w:iCs/>
+        </w:rPr>
+        <w:t xml:space="preserve">Please don’t hesitate to reach out with any questions, comments, or concerns. </w:t>
+      </w:r>
+      <w:r>
+        <w:rPr>
+          <w:rFonts w:ascii="Times New Roman" w:eastAsia="Times New Roman" w:hAnsi="Times New Roman" w:cs="Times New Roman"/>
+          <w:bCs/>
+          <w:iCs/>
         </w:rPr>
         <w:t xml:space="preserve"> </w:t>
       </w:r>
@@ -1049,38 +1132,49 @@
         <w:rPr>
           <w:rFonts w:ascii="Times New Roman" w:eastAsia="Times New Roman" w:hAnsi="Times New Roman" w:cs="Times New Roman"/>
           <w:bCs/>
-          <w:i/>
-        </w:rPr>
-        <w:t>Caleb</w:t>
-      </w:r>
-    </w:p>
-    <w:p>
-      <w:pPr>
-        <w:spacing w:before="120" w:after="120" w:line="240" w:lineRule="auto"/>
-        <w:ind w:left="360"/>
-        <w:rPr>
-          <w:rFonts w:ascii="Times New Roman" w:eastAsia="Times New Roman" w:hAnsi="Times New Roman" w:cs="Times New Roman"/>
-          <w:bCs/>
-          <w:i/>
-        </w:rPr>
-      </w:pPr>
-      <w:r>
-        <w:rPr>
-          <w:rFonts w:ascii="Times New Roman" w:eastAsia="Times New Roman" w:hAnsi="Times New Roman" w:cs="Times New Roman"/>
-          <w:bCs/>
-          <w:i/>
-        </w:rPr>
-        <w:t xml:space="preserve">Settings – Nico </w:t>
-      </w:r>
-    </w:p>
-    <w:p>
-      <w:pPr>
-        <w:spacing w:before="120" w:after="120" w:line="240" w:lineRule="auto"/>
-        <w:ind w:left="360"/>
-        <w:rPr>
-          <w:rFonts w:ascii="Times New Roman" w:eastAsia="Times New Roman" w:hAnsi="Times New Roman" w:cs="Times New Roman"/>
-          <w:bCs/>
-          <w:i/>
+          <w:iCs/>
+        </w:rPr>
+        <w:br/>
+      </w:r>
+    </w:p>
+    <w:p>
+      <w:pPr>
+        <w:pStyle w:val="ListParagraph"/>
+        <w:spacing w:before="120" w:after="120" w:line="240" w:lineRule="auto"/>
+        <w:ind w:left="360"/>
+        <w:rPr>
+          <w:rFonts w:ascii="Times New Roman" w:eastAsia="Times New Roman" w:hAnsi="Times New Roman" w:cs="Times New Roman"/>
+          <w:bCs/>
+          <w:iCs/>
+        </w:rPr>
+      </w:pPr>
+      <w:r>
+        <w:rPr>
+          <w:rFonts w:ascii="Times New Roman" w:eastAsia="Times New Roman" w:hAnsi="Times New Roman" w:cs="Times New Roman"/>
+          <w:bCs/>
+          <w:iCs/>
+        </w:rPr>
+        <w:t>Thank you,</w:t>
+      </w:r>
+      <w:r>
+        <w:rPr>
+          <w:rFonts w:ascii="Times New Roman" w:eastAsia="Times New Roman" w:hAnsi="Times New Roman" w:cs="Times New Roman"/>
+          <w:bCs/>
+          <w:iCs/>
+        </w:rPr>
+        <w:br/>
+        <w:t>--Team 22</w:t>
+      </w:r>
+    </w:p>
+    <w:p>
+      <w:pPr>
+        <w:pStyle w:val="ListParagraph"/>
+        <w:spacing w:before="120" w:after="120" w:line="240" w:lineRule="auto"/>
+        <w:ind w:left="360"/>
+        <w:rPr>
+          <w:rFonts w:ascii="Times New Roman" w:eastAsia="Times New Roman" w:hAnsi="Times New Roman" w:cs="Times New Roman"/>
+          <w:bCs/>
+          <w:iCs/>
         </w:rPr>
       </w:pPr>
     </w:p>
@@ -1104,340 +1198,28 @@
           <w:b/>
           <w:iCs/>
         </w:rPr>
-        <w:lastRenderedPageBreak/>
-        <w:t>Stakeholder Communication</w:t>
-      </w:r>
-      <w:r>
-        <w:rPr>
-          <w:rFonts w:ascii="Times New Roman" w:eastAsia="Times New Roman" w:hAnsi="Times New Roman" w:cs="Times New Roman"/>
-          <w:b/>
-          <w:iCs/>
-        </w:rPr>
-        <w:t>’</w:t>
-      </w:r>
-      <w:r>
-        <w:rPr>
-          <w:rFonts w:ascii="Times New Roman" w:eastAsia="Times New Roman" w:hAnsi="Times New Roman" w:cs="Times New Roman"/>
-          <w:b/>
-          <w:iCs/>
+        <w:t>Link to video</w:t>
+      </w:r>
+    </w:p>
+    <w:p>
+      <w:pPr>
+        <w:pStyle w:val="ListParagraph"/>
+        <w:spacing w:before="120" w:after="120" w:line="240" w:lineRule="auto"/>
+        <w:ind w:left="360"/>
+        <w:rPr>
+          <w:rFonts w:ascii="Times New Roman" w:eastAsia="Times New Roman" w:hAnsi="Times New Roman" w:cs="Times New Roman"/>
+          <w:b/>
+          <w:i/>
+        </w:rPr>
+      </w:pPr>
+      <w:r>
+        <w:rPr>
+          <w:rFonts w:ascii="Times New Roman" w:eastAsia="Times New Roman" w:hAnsi="Times New Roman" w:cs="Times New Roman"/>
+          <w:bCs/>
+          <w:i/>
         </w:rPr>
         <w:br/>
       </w:r>
-      <w:r>
-        <w:rPr>
-          <w:rFonts w:ascii="Times New Roman" w:eastAsia="Times New Roman" w:hAnsi="Times New Roman" w:cs="Times New Roman"/>
-          <w:b/>
-          <w:iCs/>
-        </w:rPr>
-        <w:t xml:space="preserve">subject: </w:t>
-      </w:r>
-      <w:r>
-        <w:rPr>
-          <w:rFonts w:ascii="Times New Roman" w:eastAsia="Times New Roman" w:hAnsi="Times New Roman" w:cs="Times New Roman"/>
-          <w:b/>
-          <w:iCs/>
-          <w:u w:val="single"/>
-        </w:rPr>
-        <w:t>Project: Seasons</w:t>
-      </w:r>
-      <w:r>
-        <w:rPr>
-          <w:rFonts w:ascii="Times New Roman" w:eastAsia="Times New Roman" w:hAnsi="Times New Roman" w:cs="Times New Roman"/>
-          <w:b/>
-          <w:iCs/>
-        </w:rPr>
-        <w:t xml:space="preserve"> progress report – </w:t>
-      </w:r>
-      <w:r>
-        <w:rPr>
-          <w:rFonts w:ascii="Times New Roman" w:eastAsia="Times New Roman" w:hAnsi="Times New Roman" w:cs="Times New Roman"/>
-          <w:b/>
-          <w:iCs/>
-        </w:rPr>
-        <w:t xml:space="preserve">Second </w:t>
-      </w:r>
-      <w:r>
-        <w:rPr>
-          <w:rFonts w:ascii="Times New Roman" w:eastAsia="Times New Roman" w:hAnsi="Times New Roman" w:cs="Times New Roman"/>
-          <w:b/>
-          <w:iCs/>
-        </w:rPr>
-        <w:t>increment</w:t>
-      </w:r>
-    </w:p>
-    <w:p>
-      <w:pPr>
-        <w:pStyle w:val="ListParagraph"/>
-        <w:spacing w:before="120" w:after="120" w:line="240" w:lineRule="auto"/>
-        <w:ind w:left="360"/>
-        <w:rPr>
-          <w:rFonts w:ascii="Times New Roman" w:eastAsia="Times New Roman" w:hAnsi="Times New Roman" w:cs="Times New Roman"/>
-          <w:bCs/>
-          <w:iCs/>
-        </w:rPr>
-      </w:pPr>
-      <w:r>
-        <w:rPr>
-          <w:rFonts w:ascii="Times New Roman" w:eastAsia="Times New Roman" w:hAnsi="Times New Roman" w:cs="Times New Roman"/>
-          <w:bCs/>
-          <w:iCs/>
-        </w:rPr>
-        <w:t>Hello [stakeholder],</w:t>
-      </w:r>
-    </w:p>
-    <w:p>
-      <w:pPr>
-        <w:pStyle w:val="ListParagraph"/>
-        <w:spacing w:before="120" w:after="120" w:line="240" w:lineRule="auto"/>
-        <w:ind w:left="360"/>
-        <w:rPr>
-          <w:rFonts w:ascii="Times New Roman" w:eastAsia="Times New Roman" w:hAnsi="Times New Roman" w:cs="Times New Roman"/>
-          <w:bCs/>
-          <w:iCs/>
-        </w:rPr>
-      </w:pPr>
-      <w:r>
-        <w:rPr>
-          <w:rFonts w:ascii="Times New Roman" w:eastAsia="Times New Roman" w:hAnsi="Times New Roman" w:cs="Times New Roman"/>
-          <w:bCs/>
-          <w:iCs/>
-        </w:rPr>
-        <w:tab/>
-        <w:t xml:space="preserve">We have been hard at work, thank you for your patience with our product. Our team has successfully completed </w:t>
-      </w:r>
-      <w:r>
-        <w:rPr>
-          <w:rFonts w:ascii="Times New Roman" w:eastAsia="Times New Roman" w:hAnsi="Times New Roman" w:cs="Times New Roman"/>
-          <w:bCs/>
-          <w:iCs/>
-        </w:rPr>
-        <w:t>the tutorial</w:t>
-      </w:r>
-      <w:r>
-        <w:rPr>
-          <w:rFonts w:ascii="Times New Roman" w:eastAsia="Times New Roman" w:hAnsi="Times New Roman" w:cs="Times New Roman"/>
-          <w:bCs/>
-          <w:iCs/>
-        </w:rPr>
-        <w:t xml:space="preserve">, </w:t>
-      </w:r>
-      <w:r>
-        <w:rPr>
-          <w:rFonts w:ascii="Times New Roman" w:eastAsia="Times New Roman" w:hAnsi="Times New Roman" w:cs="Times New Roman"/>
-          <w:bCs/>
-          <w:iCs/>
-        </w:rPr>
-        <w:t xml:space="preserve">We have </w:t>
-      </w:r>
-      <w:r>
-        <w:rPr>
-          <w:rFonts w:ascii="Times New Roman" w:eastAsia="Times New Roman" w:hAnsi="Times New Roman" w:cs="Times New Roman"/>
-          <w:bCs/>
-          <w:iCs/>
-        </w:rPr>
-        <w:t>it</w:t>
-      </w:r>
-      <w:r>
-        <w:rPr>
-          <w:rFonts w:ascii="Times New Roman" w:eastAsia="Times New Roman" w:hAnsi="Times New Roman" w:cs="Times New Roman"/>
-          <w:bCs/>
-          <w:iCs/>
-        </w:rPr>
-        <w:t xml:space="preserve"> fully functional and ready for early beta testing so that we can make sure standards are up to your liking</w:t>
-      </w:r>
-      <w:r>
-        <w:rPr>
-          <w:rFonts w:ascii="Times New Roman" w:eastAsia="Times New Roman" w:hAnsi="Times New Roman" w:cs="Times New Roman"/>
-          <w:bCs/>
-          <w:iCs/>
-        </w:rPr>
-        <w:t>, as well as more planned levels for the future</w:t>
-      </w:r>
-      <w:r>
-        <w:rPr>
-          <w:rFonts w:ascii="Times New Roman" w:eastAsia="Times New Roman" w:hAnsi="Times New Roman" w:cs="Times New Roman"/>
-          <w:bCs/>
-          <w:iCs/>
-        </w:rPr>
-        <w:t>.</w:t>
-      </w:r>
-      <w:r>
-        <w:rPr>
-          <w:rFonts w:ascii="Times New Roman" w:eastAsia="Times New Roman" w:hAnsi="Times New Roman" w:cs="Times New Roman"/>
-          <w:bCs/>
-          <w:iCs/>
-        </w:rPr>
-        <w:t xml:space="preserve"> The team is progressing smoothly;</w:t>
-      </w:r>
-      <w:r>
-        <w:rPr>
-          <w:rFonts w:ascii="Times New Roman" w:eastAsia="Times New Roman" w:hAnsi="Times New Roman" w:cs="Times New Roman"/>
-          <w:bCs/>
-          <w:iCs/>
-        </w:rPr>
-        <w:t xml:space="preserve"> in the future increment we plan on </w:t>
-      </w:r>
-      <w:r>
-        <w:rPr>
-          <w:rFonts w:ascii="Times New Roman" w:eastAsia="Times New Roman" w:hAnsi="Times New Roman" w:cs="Times New Roman"/>
-          <w:bCs/>
-          <w:iCs/>
-        </w:rPr>
-        <w:t xml:space="preserve">completing the level 1 as well as introducing and completing other levels. Furthermore, We have updated our plan slightly on the backend to primarily using </w:t>
-      </w:r>
-      <w:proofErr w:type="spellStart"/>
-      <w:r>
-        <w:rPr>
-          <w:rFonts w:ascii="Times New Roman" w:eastAsia="Times New Roman" w:hAnsi="Times New Roman" w:cs="Times New Roman"/>
-          <w:bCs/>
-          <w:iCs/>
-        </w:rPr>
-        <w:t>GDscript</w:t>
-      </w:r>
-      <w:proofErr w:type="spellEnd"/>
-      <w:r>
-        <w:rPr>
-          <w:rFonts w:ascii="Times New Roman" w:eastAsia="Times New Roman" w:hAnsi="Times New Roman" w:cs="Times New Roman"/>
-          <w:bCs/>
-          <w:iCs/>
-        </w:rPr>
-        <w:t xml:space="preserve"> as the primary project language.</w:t>
-      </w:r>
-      <w:r>
-        <w:rPr>
-          <w:rFonts w:ascii="Times New Roman" w:eastAsia="Times New Roman" w:hAnsi="Times New Roman" w:cs="Times New Roman"/>
-          <w:bCs/>
-          <w:iCs/>
-        </w:rPr>
-        <w:t xml:space="preserve"> </w:t>
-      </w:r>
-      <w:r>
-        <w:rPr>
-          <w:rFonts w:ascii="Times New Roman" w:eastAsia="Times New Roman" w:hAnsi="Times New Roman" w:cs="Times New Roman"/>
-          <w:bCs/>
-          <w:iCs/>
-        </w:rPr>
-        <w:t>W</w:t>
-      </w:r>
-      <w:r>
-        <w:rPr>
-          <w:rFonts w:ascii="Times New Roman" w:eastAsia="Times New Roman" w:hAnsi="Times New Roman" w:cs="Times New Roman"/>
-          <w:bCs/>
-          <w:iCs/>
-        </w:rPr>
-        <w:t xml:space="preserve">e will update as more things come to fruition. Please don’t hesitate to reach out with any questions, comments, or concerns. </w:t>
-      </w:r>
-      <w:r>
-        <w:rPr>
-          <w:rFonts w:ascii="Times New Roman" w:eastAsia="Times New Roman" w:hAnsi="Times New Roman" w:cs="Times New Roman"/>
-          <w:bCs/>
-          <w:iCs/>
-        </w:rPr>
-        <w:t xml:space="preserve"> </w:t>
-      </w:r>
-      <w:r>
-        <w:rPr>
-          <w:rFonts w:ascii="Times New Roman" w:eastAsia="Times New Roman" w:hAnsi="Times New Roman" w:cs="Times New Roman"/>
-          <w:bCs/>
-          <w:iCs/>
-        </w:rPr>
-        <w:br/>
-      </w:r>
-    </w:p>
-    <w:p>
-      <w:pPr>
-        <w:pStyle w:val="ListParagraph"/>
-        <w:spacing w:before="120" w:after="120" w:line="240" w:lineRule="auto"/>
-        <w:ind w:left="360"/>
-        <w:rPr>
-          <w:rFonts w:ascii="Times New Roman" w:eastAsia="Times New Roman" w:hAnsi="Times New Roman" w:cs="Times New Roman"/>
-          <w:bCs/>
-          <w:iCs/>
-        </w:rPr>
-      </w:pPr>
-      <w:r>
-        <w:rPr>
-          <w:rFonts w:ascii="Times New Roman" w:eastAsia="Times New Roman" w:hAnsi="Times New Roman" w:cs="Times New Roman"/>
-          <w:bCs/>
-          <w:iCs/>
-        </w:rPr>
-        <w:t>Thank you,</w:t>
-      </w:r>
-      <w:r>
-        <w:rPr>
-          <w:rFonts w:ascii="Times New Roman" w:eastAsia="Times New Roman" w:hAnsi="Times New Roman" w:cs="Times New Roman"/>
-          <w:bCs/>
-          <w:iCs/>
-        </w:rPr>
-        <w:br/>
-        <w:t>--Team 22</w:t>
-      </w:r>
-    </w:p>
-    <w:p>
-      <w:pPr>
-        <w:pStyle w:val="ListParagraph"/>
-        <w:spacing w:before="120" w:after="120" w:line="240" w:lineRule="auto"/>
-        <w:ind w:left="360"/>
-        <w:rPr>
-          <w:rFonts w:ascii="Times New Roman" w:eastAsia="Times New Roman" w:hAnsi="Times New Roman" w:cs="Times New Roman"/>
-          <w:bCs/>
-          <w:iCs/>
-        </w:rPr>
-      </w:pPr>
-    </w:p>
-    <w:p>
-      <w:pPr>
-        <w:pStyle w:val="ListParagraph"/>
-        <w:numPr>
-          <w:ilvl w:val="0"/>
-          <w:numId w:val="2"/>
-        </w:numPr>
-        <w:spacing w:before="120" w:after="120" w:line="240" w:lineRule="auto"/>
-        <w:rPr>
-          <w:rFonts w:ascii="Times New Roman" w:eastAsia="Times New Roman" w:hAnsi="Times New Roman" w:cs="Times New Roman"/>
-          <w:b/>
-          <w:iCs/>
-        </w:rPr>
-      </w:pPr>
-      <w:r>
-        <w:rPr>
-          <w:rFonts w:ascii="Times New Roman" w:eastAsia="Times New Roman" w:hAnsi="Times New Roman" w:cs="Times New Roman"/>
-          <w:b/>
-          <w:iCs/>
-        </w:rPr>
-        <w:t>Link to video</w:t>
-      </w:r>
-    </w:p>
-    <w:p>
-      <w:pPr>
-        <w:pStyle w:val="ListParagraph"/>
-        <w:spacing w:before="120" w:after="120" w:line="240" w:lineRule="auto"/>
-        <w:ind w:left="360"/>
-        <w:rPr>
-          <w:rFonts w:ascii="Times New Roman" w:eastAsia="Times New Roman" w:hAnsi="Times New Roman" w:cs="Times New Roman"/>
-          <w:b/>
-          <w:i/>
-        </w:rPr>
-      </w:pPr>
-      <w:r>
-        <w:rPr>
-          <w:rFonts w:ascii="Times New Roman" w:eastAsia="Times New Roman" w:hAnsi="Times New Roman" w:cs="Times New Roman"/>
-          <w:bCs/>
-          <w:i/>
-        </w:rPr>
-        <w:br/>
-      </w:r>
-      <w:hyperlink r:id="rId6" w:tgtFrame="_blank" w:tooltip="https://youtu.be/vSO9vekWpEA" w:history="1">
-        <w:r>
-          <w:rPr>
-            <w:rStyle w:val="Hyperlink"/>
-            <w:rFonts w:ascii="Times New Roman" w:eastAsia="Times New Roman" w:hAnsi="Times New Roman" w:cs="Times New Roman"/>
-            <w:bCs/>
-            <w:i/>
-          </w:rPr>
-          <w:t>https://youtu.be/vSO9vekWpEA</w:t>
-        </w:r>
-      </w:hyperlink>
       <w:r>
         <w:rPr>
           <w:rFonts w:ascii="Times New Roman" w:eastAsia="Times New Roman" w:hAnsi="Times New Roman" w:cs="Times New Roman"/>
@@ -2414,6 +2196,7 @@
   <w:style w:type="character" w:default="1" w:styleId="DefaultParagraphFont">
     <w:name w:val="Default Paragraph Font"/>
     <w:uiPriority w:val="1"/>
+    <w:semiHidden/>
     <w:unhideWhenUsed/>
   </w:style>
   <w:style w:type="table" w:default="1" w:styleId="TableNormal">
@@ -2499,6 +2282,18 @@
     <w:rPr>
       <w:color w:val="605E5C"/>
       <w:shd w:val="clear" w:color="auto" w:fill="E1DFDD"/>
+    </w:rPr>
+  </w:style>
+  <w:style w:type="character" w:styleId="FollowedHyperlink">
+    <w:name w:val="FollowedHyperlink"/>
+    <w:basedOn w:val="DefaultParagraphFont"/>
+    <w:uiPriority w:val="99"/>
+    <w:semiHidden/>
+    <w:unhideWhenUsed/>
+    <w:rsid w:val="000B4DBB"/>
+    <w:rPr>
+      <w:color w:val="954F72" w:themeColor="followedHyperlink"/>
+      <w:u w:val="single"/>
     </w:rPr>
   </w:style>
 </w:styles>

</xml_diff>